<commit_message>
Informe de mecánica: integrantes en la portada y sin anexo de datos faltantes
Co-Authored-By: Claude Opus 5.5 <noreply@anthropic.com>
</commit_message>
<xml_diff>
--- a/assets/informe_mecanica_gripper_v24.docx
+++ b/assets/informe_mecanica_gripper_v24.docx
@@ -183,7 +183,97 @@
           <w:sz w:val="32"/>
           <w:szCs w:val="32"/>
         </w:rPr>
-        <w:t>DAVID ZULUAGA HENAO</w:t>
+        <w:t>LUCAS ARANGO</w:t>
+      </w:r>
+    </w:p>
+    <w:p>
+      <w:pPr>
+        <w:jc w:val="center"/>
+        <w:rPr>
+          <w:b/>
+          <w:sz w:val="32"/>
+          <w:szCs w:val="32"/>
+        </w:rPr>
+      </w:pPr>
+      <w:r>
+        <w:rPr>
+          <w:b/>
+          <w:sz w:val="32"/>
+          <w:szCs w:val="32"/>
+        </w:rPr>
+        <w:t>SAMUEL MARTÍNEZ</w:t>
+      </w:r>
+    </w:p>
+    <w:p>
+      <w:pPr>
+        <w:jc w:val="center"/>
+        <w:rPr>
+          <w:b/>
+          <w:sz w:val="32"/>
+          <w:szCs w:val="32"/>
+        </w:rPr>
+      </w:pPr>
+      <w:r>
+        <w:rPr>
+          <w:b/>
+          <w:sz w:val="32"/>
+          <w:szCs w:val="32"/>
+        </w:rPr>
+        <w:t>MAXIMILIANO SÁNCHEZ</w:t>
+      </w:r>
+    </w:p>
+    <w:p>
+      <w:pPr>
+        <w:jc w:val="center"/>
+        <w:rPr>
+          <w:b/>
+          <w:sz w:val="32"/>
+          <w:szCs w:val="32"/>
+        </w:rPr>
+      </w:pPr>
+      <w:r>
+        <w:rPr>
+          <w:b/>
+          <w:sz w:val="32"/>
+          <w:szCs w:val="32"/>
+        </w:rPr>
+        <w:t>VALENTINA TORRES</w:t>
+      </w:r>
+    </w:p>
+    <w:p>
+      <w:pPr>
+        <w:jc w:val="center"/>
+        <w:rPr>
+          <w:b/>
+          <w:sz w:val="32"/>
+          <w:szCs w:val="32"/>
+        </w:rPr>
+      </w:pPr>
+      <w:r>
+        <w:rPr>
+          <w:b/>
+          <w:sz w:val="32"/>
+          <w:szCs w:val="32"/>
+        </w:rPr>
+        <w:t>NICOLÁS ZAPATA</w:t>
+      </w:r>
+    </w:p>
+    <w:p>
+      <w:pPr>
+        <w:jc w:val="center"/>
+        <w:rPr>
+          <w:b/>
+          <w:sz w:val="32"/>
+          <w:szCs w:val="32"/>
+        </w:rPr>
+      </w:pPr>
+      <w:r>
+        <w:rPr>
+          <w:b/>
+          <w:sz w:val="32"/>
+          <w:szCs w:val="32"/>
+        </w:rPr>
+        <w:t>DAVID ZULUAGA</w:t>
       </w:r>
     </w:p>
     <w:p>
@@ -225,6 +315,14 @@
           <w:szCs w:val="32"/>
         </w:rPr>
       </w:pPr>
+      <w:r>
+        <w:rPr>
+          <w:b/>
+          <w:sz w:val="32"/>
+          <w:szCs w:val="32"/>
+        </w:rPr>
+        <w:t>FECHA:</w:t>
+      </w:r>
     </w:p>
     <w:p>
       <w:pPr>
@@ -241,36 +339,8 @@
           <w:sz w:val="32"/>
           <w:szCs w:val="32"/>
         </w:rPr>
-        <w:t>FECHA:</w:t>
-      </w:r>
-    </w:p>
-    <w:p>
-      <w:pPr>
-        <w:jc w:val="center"/>
-        <w:rPr>
-          <w:b/>
-          <w:sz w:val="32"/>
-          <w:szCs w:val="32"/>
-        </w:rPr>
-      </w:pPr>
-      <w:r>
-        <w:rPr>
-          <w:b/>
-          <w:sz w:val="32"/>
-          <w:szCs w:val="32"/>
-        </w:rPr>
         <w:t>7 DE OCTUBRE DE 2026</w:t>
       </w:r>
-    </w:p>
-    <w:p>
-      <w:pPr>
-        <w:jc w:val="center"/>
-        <w:rPr>
-          <w:b/>
-          <w:sz w:val="32"/>
-          <w:szCs w:val="32"/>
-        </w:rPr>
-      </w:pPr>
     </w:p>
     <w:p>
       <w:pPr>
@@ -441,7 +511,7 @@
           <w:r>
             <w:fldChar w:fldCharType="separate"/>
           </w:r>
-          <w:hyperlink w:anchor="_Toc242294995" w:history="1">
+          <w:hyperlink w:anchor="_Toc242295470" w:history="1">
             <w:r>
               <w:rPr>
                 <w:rStyle w:val="Hipervnculo"/>
@@ -487,7 +557,7 @@
                 <w:noProof/>
                 <w:webHidden/>
               </w:rPr>
-              <w:instrText xml:space="preserve"> PAGEREF _Toc242294995 \h </w:instrText>
+              <w:instrText xml:space="preserve"> PAGEREF _Toc242295470 \h </w:instrText>
             </w:r>
             <w:r>
               <w:rPr>
@@ -535,7 +605,7 @@
               <w14:ligatures w14:val="standardContextual"/>
             </w:rPr>
           </w:pPr>
-          <w:hyperlink w:anchor="_Toc242294996" w:history="1">
+          <w:hyperlink w:anchor="_Toc242295471" w:history="1">
             <w:r>
               <w:rPr>
                 <w:rStyle w:val="Hipervnculo"/>
@@ -581,7 +651,7 @@
                 <w:noProof/>
                 <w:webHidden/>
               </w:rPr>
-              <w:instrText xml:space="preserve"> PAGEREF _Toc242294996 \h </w:instrText>
+              <w:instrText xml:space="preserve"> PAGEREF _Toc242295471 \h </w:instrText>
             </w:r>
             <w:r>
               <w:rPr>
@@ -629,7 +699,7 @@
               <w14:ligatures w14:val="standardContextual"/>
             </w:rPr>
           </w:pPr>
-          <w:hyperlink w:anchor="_Toc242294997" w:history="1">
+          <w:hyperlink w:anchor="_Toc242295472" w:history="1">
             <w:r>
               <w:rPr>
                 <w:rStyle w:val="Hipervnculo"/>
@@ -675,7 +745,7 @@
                 <w:noProof/>
                 <w:webHidden/>
               </w:rPr>
-              <w:instrText xml:space="preserve"> PAGEREF _Toc242294997 \h </w:instrText>
+              <w:instrText xml:space="preserve"> PAGEREF _Toc242295472 \h </w:instrText>
             </w:r>
             <w:r>
               <w:rPr>
@@ -723,7 +793,7 @@
               <w14:ligatures w14:val="standardContextual"/>
             </w:rPr>
           </w:pPr>
-          <w:hyperlink w:anchor="_Toc242294998" w:history="1">
+          <w:hyperlink w:anchor="_Toc242295473" w:history="1">
             <w:r>
               <w:rPr>
                 <w:rStyle w:val="Hipervnculo"/>
@@ -769,7 +839,7 @@
                 <w:noProof/>
                 <w:webHidden/>
               </w:rPr>
-              <w:instrText xml:space="preserve"> PAGEREF _Toc242294998 \h </w:instrText>
+              <w:instrText xml:space="preserve"> PAGEREF _Toc242295473 \h </w:instrText>
             </w:r>
             <w:r>
               <w:rPr>
@@ -817,7 +887,7 @@
               <w14:ligatures w14:val="standardContextual"/>
             </w:rPr>
           </w:pPr>
-          <w:hyperlink w:anchor="_Toc242294999" w:history="1">
+          <w:hyperlink w:anchor="_Toc242295474" w:history="1">
             <w:r>
               <w:rPr>
                 <w:rStyle w:val="Hipervnculo"/>
@@ -863,7 +933,7 @@
                 <w:noProof/>
                 <w:webHidden/>
               </w:rPr>
-              <w:instrText xml:space="preserve"> PAGEREF _Toc242294999 \h </w:instrText>
+              <w:instrText xml:space="preserve"> PAGEREF _Toc242295474 \h </w:instrText>
             </w:r>
             <w:r>
               <w:rPr>
@@ -911,7 +981,7 @@
               <w14:ligatures w14:val="standardContextual"/>
             </w:rPr>
           </w:pPr>
-          <w:hyperlink w:anchor="_Toc242295000" w:history="1">
+          <w:hyperlink w:anchor="_Toc242295475" w:history="1">
             <w:r>
               <w:rPr>
                 <w:rStyle w:val="Hipervnculo"/>
@@ -957,7 +1027,7 @@
                 <w:noProof/>
                 <w:webHidden/>
               </w:rPr>
-              <w:instrText xml:space="preserve"> PAGEREF _Toc242295000 \h </w:instrText>
+              <w:instrText xml:space="preserve"> PAGEREF _Toc242295475 \h </w:instrText>
             </w:r>
             <w:r>
               <w:rPr>
@@ -1005,7 +1075,7 @@
               <w14:ligatures w14:val="standardContextual"/>
             </w:rPr>
           </w:pPr>
-          <w:hyperlink w:anchor="_Toc242295001" w:history="1">
+          <w:hyperlink w:anchor="_Toc242295476" w:history="1">
             <w:r>
               <w:rPr>
                 <w:rStyle w:val="Hipervnculo"/>
@@ -1051,7 +1121,7 @@
                 <w:noProof/>
                 <w:webHidden/>
               </w:rPr>
-              <w:instrText xml:space="preserve"> PAGEREF _Toc242295001 \h </w:instrText>
+              <w:instrText xml:space="preserve"> PAGEREF _Toc242295476 \h </w:instrText>
             </w:r>
             <w:r>
               <w:rPr>
@@ -1099,7 +1169,7 @@
               <w14:ligatures w14:val="standardContextual"/>
             </w:rPr>
           </w:pPr>
-          <w:hyperlink w:anchor="_Toc242295002" w:history="1">
+          <w:hyperlink w:anchor="_Toc242295477" w:history="1">
             <w:r>
               <w:rPr>
                 <w:rStyle w:val="Hipervnculo"/>
@@ -1145,7 +1215,7 @@
                 <w:noProof/>
                 <w:webHidden/>
               </w:rPr>
-              <w:instrText xml:space="preserve"> PAGEREF _Toc242295002 \h </w:instrText>
+              <w:instrText xml:space="preserve"> PAGEREF _Toc242295477 \h </w:instrText>
             </w:r>
             <w:r>
               <w:rPr>
@@ -1193,7 +1263,7 @@
               <w14:ligatures w14:val="standardContextual"/>
             </w:rPr>
           </w:pPr>
-          <w:hyperlink w:anchor="_Toc242295003" w:history="1">
+          <w:hyperlink w:anchor="_Toc242295478" w:history="1">
             <w:r>
               <w:rPr>
                 <w:rStyle w:val="Hipervnculo"/>
@@ -1239,7 +1309,7 @@
                 <w:noProof/>
                 <w:webHidden/>
               </w:rPr>
-              <w:instrText xml:space="preserve"> PAGEREF _Toc242295003 \h </w:instrText>
+              <w:instrText xml:space="preserve"> PAGEREF _Toc242295478 \h </w:instrText>
             </w:r>
             <w:r>
               <w:rPr>
@@ -1287,7 +1357,7 @@
               <w14:ligatures w14:val="standardContextual"/>
             </w:rPr>
           </w:pPr>
-          <w:hyperlink w:anchor="_Toc242295004" w:history="1">
+          <w:hyperlink w:anchor="_Toc242295479" w:history="1">
             <w:r>
               <w:rPr>
                 <w:rStyle w:val="Hipervnculo"/>
@@ -1333,7 +1403,7 @@
                 <w:noProof/>
                 <w:webHidden/>
               </w:rPr>
-              <w:instrText xml:space="preserve"> PAGEREF _Toc242295004 \h </w:instrText>
+              <w:instrText xml:space="preserve"> PAGEREF _Toc242295479 \h </w:instrText>
             </w:r>
             <w:r>
               <w:rPr>
@@ -1381,7 +1451,7 @@
               <w14:ligatures w14:val="standardContextual"/>
             </w:rPr>
           </w:pPr>
-          <w:hyperlink w:anchor="_Toc242295005" w:history="1">
+          <w:hyperlink w:anchor="_Toc242295480" w:history="1">
             <w:r>
               <w:rPr>
                 <w:rStyle w:val="Hipervnculo"/>
@@ -1427,7 +1497,7 @@
                 <w:noProof/>
                 <w:webHidden/>
               </w:rPr>
-              <w:instrText xml:space="preserve"> PAGEREF _Toc242295005 \h </w:instrText>
+              <w:instrText xml:space="preserve"> PAGEREF _Toc242295480 \h </w:instrText>
             </w:r>
             <w:r>
               <w:rPr>
@@ -1475,7 +1545,7 @@
               <w14:ligatures w14:val="standardContextual"/>
             </w:rPr>
           </w:pPr>
-          <w:hyperlink w:anchor="_Toc242295006" w:history="1">
+          <w:hyperlink w:anchor="_Toc242295481" w:history="1">
             <w:r>
               <w:rPr>
                 <w:rStyle w:val="Hipervnculo"/>
@@ -1521,7 +1591,7 @@
                 <w:noProof/>
                 <w:webHidden/>
               </w:rPr>
-              <w:instrText xml:space="preserve"> PAGEREF _Toc242295006 \h </w:instrText>
+              <w:instrText xml:space="preserve"> PAGEREF _Toc242295481 \h </w:instrText>
             </w:r>
             <w:r>
               <w:rPr>
@@ -1569,7 +1639,7 @@
               <w14:ligatures w14:val="standardContextual"/>
             </w:rPr>
           </w:pPr>
-          <w:hyperlink w:anchor="_Toc242295007" w:history="1">
+          <w:hyperlink w:anchor="_Toc242295482" w:history="1">
             <w:r>
               <w:rPr>
                 <w:rStyle w:val="Hipervnculo"/>
@@ -1615,7 +1685,7 @@
                 <w:noProof/>
                 <w:webHidden/>
               </w:rPr>
-              <w:instrText xml:space="preserve"> PAGEREF _Toc242295007 \h </w:instrText>
+              <w:instrText xml:space="preserve"> PAGEREF _Toc242295482 \h </w:instrText>
             </w:r>
             <w:r>
               <w:rPr>
@@ -1663,7 +1733,7 @@
               <w14:ligatures w14:val="standardContextual"/>
             </w:rPr>
           </w:pPr>
-          <w:hyperlink w:anchor="_Toc242295008" w:history="1">
+          <w:hyperlink w:anchor="_Toc242295483" w:history="1">
             <w:r>
               <w:rPr>
                 <w:rStyle w:val="Hipervnculo"/>
@@ -1709,7 +1779,7 @@
                 <w:noProof/>
                 <w:webHidden/>
               </w:rPr>
-              <w:instrText xml:space="preserve"> PAGEREF _Toc242295008 \h </w:instrText>
+              <w:instrText xml:space="preserve"> PAGEREF _Toc242295483 \h </w:instrText>
             </w:r>
             <w:r>
               <w:rPr>
@@ -1757,7 +1827,7 @@
               <w14:ligatures w14:val="standardContextual"/>
             </w:rPr>
           </w:pPr>
-          <w:hyperlink w:anchor="_Toc242295009" w:history="1">
+          <w:hyperlink w:anchor="_Toc242295484" w:history="1">
             <w:r>
               <w:rPr>
                 <w:rStyle w:val="Hipervnculo"/>
@@ -1803,7 +1873,7 @@
                 <w:noProof/>
                 <w:webHidden/>
               </w:rPr>
-              <w:instrText xml:space="preserve"> PAGEREF _Toc242295009 \h </w:instrText>
+              <w:instrText xml:space="preserve"> PAGEREF _Toc242295484 \h </w:instrText>
             </w:r>
             <w:r>
               <w:rPr>
@@ -1851,7 +1921,7 @@
               <w14:ligatures w14:val="standardContextual"/>
             </w:rPr>
           </w:pPr>
-          <w:hyperlink w:anchor="_Toc242295010" w:history="1">
+          <w:hyperlink w:anchor="_Toc242295485" w:history="1">
             <w:r>
               <w:rPr>
                 <w:rStyle w:val="Hipervnculo"/>
@@ -1897,7 +1967,7 @@
                 <w:noProof/>
                 <w:webHidden/>
               </w:rPr>
-              <w:instrText xml:space="preserve"> PAGEREF _Toc242295010 \h </w:instrText>
+              <w:instrText xml:space="preserve"> PAGEREF _Toc242295485 \h </w:instrText>
             </w:r>
             <w:r>
               <w:rPr>
@@ -1945,7 +2015,7 @@
               <w14:ligatures w14:val="standardContextual"/>
             </w:rPr>
           </w:pPr>
-          <w:hyperlink w:anchor="_Toc242295011" w:history="1">
+          <w:hyperlink w:anchor="_Toc242295486" w:history="1">
             <w:r>
               <w:rPr>
                 <w:rStyle w:val="Hipervnculo"/>
@@ -1991,7 +2061,7 @@
                 <w:noProof/>
                 <w:webHidden/>
               </w:rPr>
-              <w:instrText xml:space="preserve"> PAGEREF _Toc242295011 \h </w:instrText>
+              <w:instrText xml:space="preserve"> PAGEREF _Toc242295486 \h </w:instrText>
             </w:r>
             <w:r>
               <w:rPr>
@@ -2039,7 +2109,7 @@
               <w14:ligatures w14:val="standardContextual"/>
             </w:rPr>
           </w:pPr>
-          <w:hyperlink w:anchor="_Toc242295012" w:history="1">
+          <w:hyperlink w:anchor="_Toc242295487" w:history="1">
             <w:r>
               <w:rPr>
                 <w:rStyle w:val="Hipervnculo"/>
@@ -2085,7 +2155,7 @@
                 <w:noProof/>
                 <w:webHidden/>
               </w:rPr>
-              <w:instrText xml:space="preserve"> PAGEREF _Toc242295012 \h </w:instrText>
+              <w:instrText xml:space="preserve"> PAGEREF _Toc242295487 \h </w:instrText>
             </w:r>
             <w:r>
               <w:rPr>
@@ -2133,7 +2203,7 @@
               <w14:ligatures w14:val="standardContextual"/>
             </w:rPr>
           </w:pPr>
-          <w:hyperlink w:anchor="_Toc242295013" w:history="1">
+          <w:hyperlink w:anchor="_Toc242295488" w:history="1">
             <w:r>
               <w:rPr>
                 <w:rStyle w:val="Hipervnculo"/>
@@ -2179,7 +2249,7 @@
                 <w:noProof/>
                 <w:webHidden/>
               </w:rPr>
-              <w:instrText xml:space="preserve"> PAGEREF _Toc242295013 \h </w:instrText>
+              <w:instrText xml:space="preserve"> PAGEREF _Toc242295488 \h </w:instrText>
             </w:r>
             <w:r>
               <w:rPr>
@@ -2227,7 +2297,7 @@
               <w14:ligatures w14:val="standardContextual"/>
             </w:rPr>
           </w:pPr>
-          <w:hyperlink w:anchor="_Toc242295014" w:history="1">
+          <w:hyperlink w:anchor="_Toc242295489" w:history="1">
             <w:r>
               <w:rPr>
                 <w:rStyle w:val="Hipervnculo"/>
@@ -2273,7 +2343,7 @@
                 <w:noProof/>
                 <w:webHidden/>
               </w:rPr>
-              <w:instrText xml:space="preserve"> PAGEREF _Toc242295014 \h </w:instrText>
+              <w:instrText xml:space="preserve"> PAGEREF _Toc242295489 \h </w:instrText>
             </w:r>
             <w:r>
               <w:rPr>
@@ -2315,7 +2385,7 @@
               <w:noProof/>
             </w:rPr>
           </w:pPr>
-          <w:hyperlink w:anchor="_Toc242295015" w:history="1">
+          <w:hyperlink w:anchor="_Toc242295490" w:history="1">
             <w:r>
               <w:rPr>
                 <w:rStyle w:val="Hipervnculo"/>
@@ -2355,7 +2425,7 @@
                 <w:noProof/>
                 <w:webHidden/>
               </w:rPr>
-              <w:instrText xml:space="preserve"> PAGEREF _Toc242295015 \h </w:instrText>
+              <w:instrText xml:space="preserve"> PAGEREF _Toc242295490 \h </w:instrText>
             </w:r>
             <w:r>
               <w:rPr>
@@ -2397,7 +2467,7 @@
               <w:noProof/>
             </w:rPr>
           </w:pPr>
-          <w:hyperlink w:anchor="_Toc242295016" w:history="1">
+          <w:hyperlink w:anchor="_Toc242295491" w:history="1">
             <w:r>
               <w:rPr>
                 <w:rStyle w:val="Hipervnculo"/>
@@ -2437,7 +2507,7 @@
                 <w:noProof/>
                 <w:webHidden/>
               </w:rPr>
-              <w:instrText xml:space="preserve"> PAGEREF _Toc242295016 \h </w:instrText>
+              <w:instrText xml:space="preserve"> PAGEREF _Toc242295491 \h </w:instrText>
             </w:r>
             <w:r>
               <w:rPr>
@@ -2479,7 +2549,7 @@
               <w:noProof/>
             </w:rPr>
           </w:pPr>
-          <w:hyperlink w:anchor="_Toc242295017" w:history="1">
+          <w:hyperlink w:anchor="_Toc242295492" w:history="1">
             <w:r>
               <w:rPr>
                 <w:rStyle w:val="Hipervnculo"/>
@@ -2519,7 +2589,7 @@
                 <w:noProof/>
                 <w:webHidden/>
               </w:rPr>
-              <w:instrText xml:space="preserve"> PAGEREF _Toc242295017 \h </w:instrText>
+              <w:instrText xml:space="preserve"> PAGEREF _Toc242295492 \h </w:instrText>
             </w:r>
             <w:r>
               <w:rPr>
@@ -2561,7 +2631,7 @@
               <w:noProof/>
             </w:rPr>
           </w:pPr>
-          <w:hyperlink w:anchor="_Toc242295018" w:history="1">
+          <w:hyperlink w:anchor="_Toc242295493" w:history="1">
             <w:r>
               <w:rPr>
                 <w:rStyle w:val="Hipervnculo"/>
@@ -2601,7 +2671,7 @@
                 <w:noProof/>
                 <w:webHidden/>
               </w:rPr>
-              <w:instrText xml:space="preserve"> PAGEREF _Toc242295018 \h </w:instrText>
+              <w:instrText xml:space="preserve"> PAGEREF _Toc242295493 \h </w:instrText>
             </w:r>
             <w:r>
               <w:rPr>
@@ -2643,7 +2713,7 @@
               <w:noProof/>
             </w:rPr>
           </w:pPr>
-          <w:hyperlink w:anchor="_Toc242295019" w:history="1">
+          <w:hyperlink w:anchor="_Toc242295494" w:history="1">
             <w:r>
               <w:rPr>
                 <w:rStyle w:val="Hipervnculo"/>
@@ -2683,7 +2753,7 @@
                 <w:noProof/>
                 <w:webHidden/>
               </w:rPr>
-              <w:instrText xml:space="preserve"> PAGEREF _Toc242295019 \h </w:instrText>
+              <w:instrText xml:space="preserve"> PAGEREF _Toc242295494 \h </w:instrText>
             </w:r>
             <w:r>
               <w:rPr>
@@ -2725,7 +2795,7 @@
               <w:noProof/>
             </w:rPr>
           </w:pPr>
-          <w:hyperlink w:anchor="_Toc242295020" w:history="1">
+          <w:hyperlink w:anchor="_Toc242295495" w:history="1">
             <w:r>
               <w:rPr>
                 <w:rStyle w:val="Hipervnculo"/>
@@ -2765,7 +2835,7 @@
                 <w:noProof/>
                 <w:webHidden/>
               </w:rPr>
-              <w:instrText xml:space="preserve"> PAGEREF _Toc242295020 \h </w:instrText>
+              <w:instrText xml:space="preserve"> PAGEREF _Toc242295495 \h </w:instrText>
             </w:r>
             <w:r>
               <w:rPr>
@@ -2807,7 +2877,7 @@
               <w:noProof/>
             </w:rPr>
           </w:pPr>
-          <w:hyperlink w:anchor="_Toc242295021" w:history="1">
+          <w:hyperlink w:anchor="_Toc242295496" w:history="1">
             <w:r>
               <w:rPr>
                 <w:rStyle w:val="Hipervnculo"/>
@@ -2847,7 +2917,7 @@
                 <w:noProof/>
                 <w:webHidden/>
               </w:rPr>
-              <w:instrText xml:space="preserve"> PAGEREF _Toc242295021 \h </w:instrText>
+              <w:instrText xml:space="preserve"> PAGEREF _Toc242295496 \h </w:instrText>
             </w:r>
             <w:r>
               <w:rPr>
@@ -2895,7 +2965,7 @@
               <w14:ligatures w14:val="standardContextual"/>
             </w:rPr>
           </w:pPr>
-          <w:hyperlink w:anchor="_Toc242295022" w:history="1">
+          <w:hyperlink w:anchor="_Toc242295497" w:history="1">
             <w:r>
               <w:rPr>
                 <w:rStyle w:val="Hipervnculo"/>
@@ -2941,7 +3011,7 @@
                 <w:noProof/>
                 <w:webHidden/>
               </w:rPr>
-              <w:instrText xml:space="preserve"> PAGEREF _Toc242295022 \h </w:instrText>
+              <w:instrText xml:space="preserve"> PAGEREF _Toc242295497 \h </w:instrText>
             </w:r>
             <w:r>
               <w:rPr>
@@ -2989,7 +3059,7 @@
               <w14:ligatures w14:val="standardContextual"/>
             </w:rPr>
           </w:pPr>
-          <w:hyperlink w:anchor="_Toc242295023" w:history="1">
+          <w:hyperlink w:anchor="_Toc242295498" w:history="1">
             <w:r>
               <w:rPr>
                 <w:rStyle w:val="Hipervnculo"/>
@@ -3035,7 +3105,7 @@
                 <w:noProof/>
                 <w:webHidden/>
               </w:rPr>
-              <w:instrText xml:space="preserve"> PAGEREF _Toc242295023 \h </w:instrText>
+              <w:instrText xml:space="preserve"> PAGEREF _Toc242295498 \h </w:instrText>
             </w:r>
             <w:r>
               <w:rPr>
@@ -3083,7 +3153,7 @@
               <w14:ligatures w14:val="standardContextual"/>
             </w:rPr>
           </w:pPr>
-          <w:hyperlink w:anchor="_Toc242295024" w:history="1">
+          <w:hyperlink w:anchor="_Toc242295499" w:history="1">
             <w:r>
               <w:rPr>
                 <w:rStyle w:val="Hipervnculo"/>
@@ -3129,7 +3199,7 @@
                 <w:noProof/>
                 <w:webHidden/>
               </w:rPr>
-              <w:instrText xml:space="preserve"> PAGEREF _Toc242295024 \h </w:instrText>
+              <w:instrText xml:space="preserve"> PAGEREF _Toc242295499 \h </w:instrText>
             </w:r>
             <w:r>
               <w:rPr>
@@ -3177,7 +3247,7 @@
               <w14:ligatures w14:val="standardContextual"/>
             </w:rPr>
           </w:pPr>
-          <w:hyperlink w:anchor="_Toc242295025" w:history="1">
+          <w:hyperlink w:anchor="_Toc242295500" w:history="1">
             <w:r>
               <w:rPr>
                 <w:rStyle w:val="Hipervnculo"/>
@@ -3223,7 +3293,7 @@
                 <w:noProof/>
                 <w:webHidden/>
               </w:rPr>
-              <w:instrText xml:space="preserve"> PAGEREF _Toc242295025 \h </w:instrText>
+              <w:instrText xml:space="preserve"> PAGEREF _Toc242295500 \h </w:instrText>
             </w:r>
             <w:r>
               <w:rPr>
@@ -3271,7 +3341,7 @@
               <w14:ligatures w14:val="standardContextual"/>
             </w:rPr>
           </w:pPr>
-          <w:hyperlink w:anchor="_Toc242295026" w:history="1">
+          <w:hyperlink w:anchor="_Toc242295501" w:history="1">
             <w:r>
               <w:rPr>
                 <w:rStyle w:val="Hipervnculo"/>
@@ -3317,7 +3387,7 @@
                 <w:noProof/>
                 <w:webHidden/>
               </w:rPr>
-              <w:instrText xml:space="preserve"> PAGEREF _Toc242295026 \h </w:instrText>
+              <w:instrText xml:space="preserve"> PAGEREF _Toc242295501 \h </w:instrText>
             </w:r>
             <w:r>
               <w:rPr>
@@ -3365,7 +3435,7 @@
               <w14:ligatures w14:val="standardContextual"/>
             </w:rPr>
           </w:pPr>
-          <w:hyperlink w:anchor="_Toc242295027" w:history="1">
+          <w:hyperlink w:anchor="_Toc242295502" w:history="1">
             <w:r>
               <w:rPr>
                 <w:rStyle w:val="Hipervnculo"/>
@@ -3411,7 +3481,7 @@
                 <w:noProof/>
                 <w:webHidden/>
               </w:rPr>
-              <w:instrText xml:space="preserve"> PAGEREF _Toc242295027 \h </w:instrText>
+              <w:instrText xml:space="preserve"> PAGEREF _Toc242295502 \h </w:instrText>
             </w:r>
             <w:r>
               <w:rPr>
@@ -3459,7 +3529,7 @@
               <w14:ligatures w14:val="standardContextual"/>
             </w:rPr>
           </w:pPr>
-          <w:hyperlink w:anchor="_Toc242295028" w:history="1">
+          <w:hyperlink w:anchor="_Toc242295503" w:history="1">
             <w:r>
               <w:rPr>
                 <w:rStyle w:val="Hipervnculo"/>
@@ -3505,7 +3575,7 @@
                 <w:noProof/>
                 <w:webHidden/>
               </w:rPr>
-              <w:instrText xml:space="preserve"> PAGEREF _Toc242295028 \h </w:instrText>
+              <w:instrText xml:space="preserve"> PAGEREF _Toc242295503 \h </w:instrText>
             </w:r>
             <w:r>
               <w:rPr>
@@ -3553,7 +3623,7 @@
               <w14:ligatures w14:val="standardContextual"/>
             </w:rPr>
           </w:pPr>
-          <w:hyperlink w:anchor="_Toc242295029" w:history="1">
+          <w:hyperlink w:anchor="_Toc242295504" w:history="1">
             <w:r>
               <w:rPr>
                 <w:rStyle w:val="Hipervnculo"/>
@@ -3599,7 +3669,7 @@
                 <w:noProof/>
                 <w:webHidden/>
               </w:rPr>
-              <w:instrText xml:space="preserve"> PAGEREF _Toc242295029 \h </w:instrText>
+              <w:instrText xml:space="preserve"> PAGEREF _Toc242295504 \h </w:instrText>
             </w:r>
             <w:r>
               <w:rPr>
@@ -3647,7 +3717,7 @@
               <w14:ligatures w14:val="standardContextual"/>
             </w:rPr>
           </w:pPr>
-          <w:hyperlink w:anchor="_Toc242295030" w:history="1">
+          <w:hyperlink w:anchor="_Toc242295505" w:history="1">
             <w:r>
               <w:rPr>
                 <w:rStyle w:val="Hipervnculo"/>
@@ -3693,7 +3763,7 @@
                 <w:noProof/>
                 <w:webHidden/>
               </w:rPr>
-              <w:instrText xml:space="preserve"> PAGEREF _Toc242295030 \h </w:instrText>
+              <w:instrText xml:space="preserve"> PAGEREF _Toc242295505 \h </w:instrText>
             </w:r>
             <w:r>
               <w:rPr>
@@ -3741,7 +3811,7 @@
               <w14:ligatures w14:val="standardContextual"/>
             </w:rPr>
           </w:pPr>
-          <w:hyperlink w:anchor="_Toc242295031" w:history="1">
+          <w:hyperlink w:anchor="_Toc242295506" w:history="1">
             <w:r>
               <w:rPr>
                 <w:rStyle w:val="Hipervnculo"/>
@@ -3787,7 +3857,7 @@
                 <w:noProof/>
                 <w:webHidden/>
               </w:rPr>
-              <w:instrText xml:space="preserve"> PAGEREF _Toc242295031 \h </w:instrText>
+              <w:instrText xml:space="preserve"> PAGEREF _Toc242295506 \h </w:instrText>
             </w:r>
             <w:r>
               <w:rPr>
@@ -3835,7 +3905,7 @@
               <w14:ligatures w14:val="standardContextual"/>
             </w:rPr>
           </w:pPr>
-          <w:hyperlink w:anchor="_Toc242295032" w:history="1">
+          <w:hyperlink w:anchor="_Toc242295507" w:history="1">
             <w:r>
               <w:rPr>
                 <w:rStyle w:val="Hipervnculo"/>
@@ -3881,7 +3951,7 @@
                 <w:noProof/>
                 <w:webHidden/>
               </w:rPr>
-              <w:instrText xml:space="preserve"> PAGEREF _Toc242295032 \h </w:instrText>
+              <w:instrText xml:space="preserve"> PAGEREF _Toc242295507 \h </w:instrText>
             </w:r>
             <w:r>
               <w:rPr>
@@ -3929,7 +3999,7 @@
               <w14:ligatures w14:val="standardContextual"/>
             </w:rPr>
           </w:pPr>
-          <w:hyperlink w:anchor="_Toc242295033" w:history="1">
+          <w:hyperlink w:anchor="_Toc242295508" w:history="1">
             <w:r>
               <w:rPr>
                 <w:rStyle w:val="Hipervnculo"/>
@@ -3975,7 +4045,7 @@
                 <w:noProof/>
                 <w:webHidden/>
               </w:rPr>
-              <w:instrText xml:space="preserve"> PAGEREF _Toc242295033 \h </w:instrText>
+              <w:instrText xml:space="preserve"> PAGEREF _Toc242295508 \h </w:instrText>
             </w:r>
             <w:r>
               <w:rPr>
@@ -4023,7 +4093,7 @@
               <w14:ligatures w14:val="standardContextual"/>
             </w:rPr>
           </w:pPr>
-          <w:hyperlink w:anchor="_Toc242295034" w:history="1">
+          <w:hyperlink w:anchor="_Toc242295509" w:history="1">
             <w:r>
               <w:rPr>
                 <w:rStyle w:val="Hipervnculo"/>
@@ -4069,7 +4139,7 @@
                 <w:noProof/>
                 <w:webHidden/>
               </w:rPr>
-              <w:instrText xml:space="preserve"> PAGEREF _Toc242295034 \h </w:instrText>
+              <w:instrText xml:space="preserve"> PAGEREF _Toc242295509 \h </w:instrText>
             </w:r>
             <w:r>
               <w:rPr>
@@ -4117,7 +4187,7 @@
               <w14:ligatures w14:val="standardContextual"/>
             </w:rPr>
           </w:pPr>
-          <w:hyperlink w:anchor="_Toc242295035" w:history="1">
+          <w:hyperlink w:anchor="_Toc242295510" w:history="1">
             <w:r>
               <w:rPr>
                 <w:rStyle w:val="Hipervnculo"/>
@@ -4163,7 +4233,7 @@
                 <w:noProof/>
                 <w:webHidden/>
               </w:rPr>
-              <w:instrText xml:space="preserve"> PAGEREF _Toc242295035 \h </w:instrText>
+              <w:instrText xml:space="preserve"> PAGEREF _Toc242295510 \h </w:instrText>
             </w:r>
             <w:r>
               <w:rPr>
@@ -4211,7 +4281,7 @@
               <w14:ligatures w14:val="standardContextual"/>
             </w:rPr>
           </w:pPr>
-          <w:hyperlink w:anchor="_Toc242295036" w:history="1">
+          <w:hyperlink w:anchor="_Toc242295511" w:history="1">
             <w:r>
               <w:rPr>
                 <w:rStyle w:val="Hipervnculo"/>
@@ -4257,7 +4327,7 @@
                 <w:noProof/>
                 <w:webHidden/>
               </w:rPr>
-              <w:instrText xml:space="preserve"> PAGEREF _Toc242295036 \h </w:instrText>
+              <w:instrText xml:space="preserve"> PAGEREF _Toc242295511 \h </w:instrText>
             </w:r>
             <w:r>
               <w:rPr>
@@ -4305,7 +4375,7 @@
               <w14:ligatures w14:val="standardContextual"/>
             </w:rPr>
           </w:pPr>
-          <w:hyperlink w:anchor="_Toc242295037" w:history="1">
+          <w:hyperlink w:anchor="_Toc242295512" w:history="1">
             <w:r>
               <w:rPr>
                 <w:rStyle w:val="Hipervnculo"/>
@@ -4351,7 +4421,7 @@
                 <w:noProof/>
                 <w:webHidden/>
               </w:rPr>
-              <w:instrText xml:space="preserve"> PAGEREF _Toc242295037 \h </w:instrText>
+              <w:instrText xml:space="preserve"> PAGEREF _Toc242295512 \h </w:instrText>
             </w:r>
             <w:r>
               <w:rPr>
@@ -4399,7 +4469,7 @@
               <w14:ligatures w14:val="standardContextual"/>
             </w:rPr>
           </w:pPr>
-          <w:hyperlink w:anchor="_Toc242295038" w:history="1">
+          <w:hyperlink w:anchor="_Toc242295513" w:history="1">
             <w:r>
               <w:rPr>
                 <w:rStyle w:val="Hipervnculo"/>
@@ -4445,7 +4515,7 @@
                 <w:noProof/>
                 <w:webHidden/>
               </w:rPr>
-              <w:instrText xml:space="preserve"> PAGEREF _Toc242295038 \h </w:instrText>
+              <w:instrText xml:space="preserve"> PAGEREF _Toc242295513 \h </w:instrText>
             </w:r>
             <w:r>
               <w:rPr>
@@ -4493,7 +4563,7 @@
               <w14:ligatures w14:val="standardContextual"/>
             </w:rPr>
           </w:pPr>
-          <w:hyperlink w:anchor="_Toc242295039" w:history="1">
+          <w:hyperlink w:anchor="_Toc242295514" w:history="1">
             <w:r>
               <w:rPr>
                 <w:rStyle w:val="Hipervnculo"/>
@@ -4539,7 +4609,7 @@
                 <w:noProof/>
                 <w:webHidden/>
               </w:rPr>
-              <w:instrText xml:space="preserve"> PAGEREF _Toc242295039 \h </w:instrText>
+              <w:instrText xml:space="preserve"> PAGEREF _Toc242295514 \h </w:instrText>
             </w:r>
             <w:r>
               <w:rPr>
@@ -4587,7 +4657,7 @@
               <w14:ligatures w14:val="standardContextual"/>
             </w:rPr>
           </w:pPr>
-          <w:hyperlink w:anchor="_Toc242295040" w:history="1">
+          <w:hyperlink w:anchor="_Toc242295515" w:history="1">
             <w:r>
               <w:rPr>
                 <w:rStyle w:val="Hipervnculo"/>
@@ -4633,7 +4703,7 @@
                 <w:noProof/>
                 <w:webHidden/>
               </w:rPr>
-              <w:instrText xml:space="preserve"> PAGEREF _Toc242295040 \h </w:instrText>
+              <w:instrText xml:space="preserve"> PAGEREF _Toc242295515 \h </w:instrText>
             </w:r>
             <w:r>
               <w:rPr>
@@ -4681,7 +4751,7 @@
               <w14:ligatures w14:val="standardContextual"/>
             </w:rPr>
           </w:pPr>
-          <w:hyperlink w:anchor="_Toc242295041" w:history="1">
+          <w:hyperlink w:anchor="_Toc242295516" w:history="1">
             <w:r>
               <w:rPr>
                 <w:rStyle w:val="Hipervnculo"/>
@@ -4727,7 +4797,7 @@
                 <w:noProof/>
                 <w:webHidden/>
               </w:rPr>
-              <w:instrText xml:space="preserve"> PAGEREF _Toc242295041 \h </w:instrText>
+              <w:instrText xml:space="preserve"> PAGEREF _Toc242295516 \h </w:instrText>
             </w:r>
             <w:r>
               <w:rPr>
@@ -4775,7 +4845,7 @@
               <w14:ligatures w14:val="standardContextual"/>
             </w:rPr>
           </w:pPr>
-          <w:hyperlink w:anchor="_Toc242295042" w:history="1">
+          <w:hyperlink w:anchor="_Toc242295517" w:history="1">
             <w:r>
               <w:rPr>
                 <w:rStyle w:val="Hipervnculo"/>
@@ -4821,7 +4891,7 @@
                 <w:noProof/>
                 <w:webHidden/>
               </w:rPr>
-              <w:instrText xml:space="preserve"> PAGEREF _Toc242295042 \h </w:instrText>
+              <w:instrText xml:space="preserve"> PAGEREF _Toc242295517 \h </w:instrText>
             </w:r>
             <w:r>
               <w:rPr>
@@ -4842,100 +4912,6 @@
                 <w:webHidden/>
               </w:rPr>
               <w:t>40</w:t>
-            </w:r>
-            <w:r>
-              <w:rPr>
-                <w:noProof/>
-                <w:webHidden/>
-              </w:rPr>
-              <w:fldChar w:fldCharType="end"/>
-            </w:r>
-          </w:hyperlink>
-        </w:p>
-        <w:p>
-          <w:pPr>
-            <w:pStyle w:val="TDC1"/>
-            <w:tabs>
-              <w:tab w:val="left" w:pos="440"/>
-              <w:tab w:val="right" w:leader="dot" w:pos="8828"/>
-            </w:tabs>
-            <w:rPr>
-              <w:rFonts w:asciiTheme="minorHAnsi" w:eastAsiaTheme="minorEastAsia" w:hAnsiTheme="minorHAnsi" w:cstheme="minorBidi"/>
-              <w:noProof/>
-              <w:kern w:val="2"/>
-              <w:sz w:val="24"/>
-              <w:szCs w:val="24"/>
-              <w:lang w:val="en-US"/>
-              <w14:ligatures w14:val="standardContextual"/>
-            </w:rPr>
-          </w:pPr>
-          <w:hyperlink w:anchor="_Toc242295043" w:history="1">
-            <w:r>
-              <w:rPr>
-                <w:rStyle w:val="Hipervnculo"/>
-                <w:noProof/>
-              </w:rPr>
-              <w:t>9.</w:t>
-            </w:r>
-            <w:r>
-              <w:rPr>
-                <w:rFonts w:asciiTheme="minorHAnsi" w:eastAsiaTheme="minorEastAsia" w:hAnsiTheme="minorHAnsi" w:cstheme="minorBidi"/>
-                <w:noProof/>
-                <w:kern w:val="2"/>
-                <w:sz w:val="24"/>
-                <w:szCs w:val="24"/>
-                <w:lang w:val="en-US"/>
-                <w14:ligatures w14:val="standardContextual"/>
-              </w:rPr>
-              <w:tab/>
-            </w:r>
-            <w:r>
-              <w:rPr>
-                <w:rStyle w:val="Hipervnculo"/>
-                <w:noProof/>
-              </w:rPr>
-              <w:t>Datos faltantes del plano</w:t>
-            </w:r>
-            <w:r>
-              <w:rPr>
-                <w:noProof/>
-                <w:webHidden/>
-              </w:rPr>
-              <w:tab/>
-            </w:r>
-            <w:r>
-              <w:rPr>
-                <w:noProof/>
-                <w:webHidden/>
-              </w:rPr>
-              <w:fldChar w:fldCharType="begin"/>
-            </w:r>
-            <w:r>
-              <w:rPr>
-                <w:noProof/>
-                <w:webHidden/>
-              </w:rPr>
-              <w:instrText xml:space="preserve"> PAGEREF _Toc242295043 \h </w:instrText>
-            </w:r>
-            <w:r>
-              <w:rPr>
-                <w:noProof/>
-                <w:webHidden/>
-              </w:rPr>
-            </w:r>
-            <w:r>
-              <w:rPr>
-                <w:noProof/>
-                <w:webHidden/>
-              </w:rPr>
-              <w:fldChar w:fldCharType="separate"/>
-            </w:r>
-            <w:r>
-              <w:rPr>
-                <w:noProof/>
-                <w:webHidden/>
-              </w:rPr>
-              <w:t>41</w:t>
             </w:r>
             <w:r>
               <w:rPr>
@@ -4971,7 +4947,7 @@
         <w:spacing w:before="240" w:after="120"/>
         <w:jc w:val="left"/>
       </w:pPr>
-      <w:bookmarkStart w:id="0" w:name="_Toc242294995"/>
+      <w:bookmarkStart w:id="0" w:name="_Toc242295470"/>
       <w:r>
         <w:lastRenderedPageBreak/>
         <w:t>Introducción</w:t>
@@ -5009,7 +4985,7 @@
         <w:spacing w:before="240" w:after="120"/>
         <w:jc w:val="left"/>
       </w:pPr>
-      <w:bookmarkStart w:id="1" w:name="_Toc242294996"/>
+      <w:bookmarkStart w:id="1" w:name="_Toc242295471"/>
       <w:r>
         <w:lastRenderedPageBreak/>
         <w:t>Objetivos</w:t>
@@ -5022,7 +4998,7 @@
         <w:spacing w:before="160" w:after="120"/>
         <w:jc w:val="left"/>
       </w:pPr>
-      <w:bookmarkStart w:id="2" w:name="_Toc242294997"/>
+      <w:bookmarkStart w:id="2" w:name="_Toc242295472"/>
       <w:r>
         <w:t>Objetivo general</w:t>
       </w:r>
@@ -5042,7 +5018,7 @@
         <w:spacing w:before="160" w:after="120"/>
         <w:jc w:val="left"/>
       </w:pPr>
-      <w:bookmarkStart w:id="3" w:name="_Toc242294998"/>
+      <w:bookmarkStart w:id="3" w:name="_Toc242295473"/>
       <w:r>
         <w:t>Objetivos específicos</w:t>
       </w:r>
@@ -5139,7 +5115,7 @@
         <w:spacing w:before="240" w:after="120"/>
         <w:jc w:val="left"/>
       </w:pPr>
-      <w:bookmarkStart w:id="4" w:name="_Toc242294999"/>
+      <w:bookmarkStart w:id="4" w:name="_Toc242295474"/>
       <w:r>
         <w:lastRenderedPageBreak/>
         <w:t>Datos de entrada</w:t>
@@ -5152,7 +5128,7 @@
         <w:spacing w:before="160" w:after="120"/>
         <w:jc w:val="left"/>
       </w:pPr>
-      <w:bookmarkStart w:id="5" w:name="_Toc242295000"/>
+      <w:bookmarkStart w:id="5" w:name="_Toc242295475"/>
       <w:r>
         <w:t>Plano de medidas V2.4</w:t>
       </w:r>
@@ -5186,10 +5162,10 @@
           <w:noProof/>
         </w:rPr>
         <w:drawing>
-          <wp:inline distT="0" distB="0" distL="0" distR="0" wp14:anchorId="3A02F122" wp14:editId="553B2BA6">
+          <wp:inline distT="0" distB="0" distL="0" distR="0" wp14:anchorId="28D9745A" wp14:editId="0AE6CB1B">
             <wp:extent cx="5612130" cy="3967480"/>
             <wp:effectExtent l="0" t="0" r="7620" b="0"/>
-            <wp:docPr id="1027112508" name="Imagen 1"/>
+            <wp:docPr id="1686424039" name="Imagen 1"/>
             <wp:cNvGraphicFramePr>
               <a:graphicFrameLocks xmlns:a="http://schemas.openxmlformats.org/drawingml/2006/main" noChangeAspect="1"/>
             </wp:cNvGraphicFramePr>
@@ -5197,7 +5173,7 @@
               <a:graphicData uri="http://schemas.openxmlformats.org/drawingml/2006/picture">
                 <pic:pic xmlns:pic="http://schemas.openxmlformats.org/drawingml/2006/picture">
                   <pic:nvPicPr>
-                    <pic:cNvPr id="1027112508" name=""/>
+                    <pic:cNvPr id="1686424039" name=""/>
                     <pic:cNvPicPr/>
                   </pic:nvPicPr>
                   <pic:blipFill>
@@ -6710,7 +6686,7 @@
         <w:spacing w:before="160" w:after="120"/>
         <w:jc w:val="left"/>
       </w:pPr>
-      <w:bookmarkStart w:id="6" w:name="_Toc242295001"/>
+      <w:bookmarkStart w:id="6" w:name="_Toc242295476"/>
       <w:r>
         <w:t>Transmisiones y motores</w:t>
       </w:r>
@@ -7295,7 +7271,7 @@
         <w:spacing w:before="240" w:after="120"/>
         <w:jc w:val="left"/>
       </w:pPr>
-      <w:bookmarkStart w:id="7" w:name="_Toc242295002"/>
+      <w:bookmarkStart w:id="7" w:name="_Toc242295477"/>
       <w:r>
         <w:lastRenderedPageBreak/>
         <w:t>Cálculos estáticos (3.1)</w:t>
@@ -7308,7 +7284,7 @@
         <w:spacing w:before="160" w:after="120"/>
         <w:jc w:val="left"/>
       </w:pPr>
-      <w:bookmarkStart w:id="8" w:name="_Toc242295003"/>
+      <w:bookmarkStart w:id="8" w:name="_Toc242295478"/>
       <w:r>
         <w:t>Descripción</w:t>
       </w:r>
@@ -7328,7 +7304,7 @@
         <w:spacing w:before="160" w:after="120"/>
         <w:jc w:val="left"/>
       </w:pPr>
-      <w:bookmarkStart w:id="9" w:name="_Toc242295004"/>
+      <w:bookmarkStart w:id="9" w:name="_Toc242295479"/>
       <w:r>
         <w:t>Objetivo de cálculo</w:t>
       </w:r>
@@ -7396,7 +7372,7 @@
         <w:spacing w:before="160" w:after="120"/>
         <w:jc w:val="left"/>
       </w:pPr>
-      <w:bookmarkStart w:id="10" w:name="_Toc242295005"/>
+      <w:bookmarkStart w:id="10" w:name="_Toc242295480"/>
       <w:r>
         <w:t>Variables del modelo de cálculo</w:t>
       </w:r>
@@ -7860,7 +7836,7 @@
         <w:spacing w:before="160" w:after="120"/>
         <w:jc w:val="left"/>
       </w:pPr>
-      <w:bookmarkStart w:id="11" w:name="_Toc242295006"/>
+      <w:bookmarkStart w:id="11" w:name="_Toc242295481"/>
       <w:r>
         <w:t>Modelo de cálculo</w:t>
       </w:r>
@@ -8802,7 +8778,7 @@
         <w:spacing w:before="160" w:after="120"/>
         <w:jc w:val="left"/>
       </w:pPr>
-      <w:bookmarkStart w:id="12" w:name="_Toc242295007"/>
+      <w:bookmarkStart w:id="12" w:name="_Toc242295482"/>
       <w:r>
         <w:t>Valores del modelo de cálculo</w:t>
       </w:r>
@@ -14576,7 +14552,7 @@
         <w:spacing w:before="160" w:after="120"/>
         <w:jc w:val="left"/>
       </w:pPr>
-      <w:bookmarkStart w:id="13" w:name="_Toc242295008"/>
+      <w:bookmarkStart w:id="13" w:name="_Toc242295483"/>
       <w:r>
         <w:t>Resultados vista lateral</w:t>
       </w:r>
@@ -14601,10 +14577,10 @@
           <w:noProof/>
         </w:rPr>
         <w:drawing>
-          <wp:inline distT="0" distB="0" distL="0" distR="0" wp14:anchorId="2C89EC92" wp14:editId="13DB0AD4">
+          <wp:inline distT="0" distB="0" distL="0" distR="0" wp14:anchorId="50C4B2A6" wp14:editId="6FC59B61">
             <wp:extent cx="3479165" cy="3479165"/>
             <wp:effectExtent l="0" t="0" r="6985" b="6985"/>
-            <wp:docPr id="205161174" name="Imagen 2"/>
+            <wp:docPr id="1684774158" name="Imagen 2"/>
             <wp:cNvGraphicFramePr>
               <a:graphicFrameLocks xmlns:a="http://schemas.openxmlformats.org/drawingml/2006/main" noChangeAspect="1"/>
             </wp:cNvGraphicFramePr>
@@ -14612,7 +14588,7 @@
               <a:graphicData uri="http://schemas.openxmlformats.org/drawingml/2006/picture">
                 <pic:pic xmlns:pic="http://schemas.openxmlformats.org/drawingml/2006/picture">
                   <pic:nvPicPr>
-                    <pic:cNvPr id="205161174" name=""/>
+                    <pic:cNvPr id="1684774158" name=""/>
                     <pic:cNvPicPr/>
                   </pic:nvPicPr>
                   <pic:blipFill>
@@ -20491,7 +20467,7 @@
         <w:spacing w:before="160" w:after="120"/>
         <w:jc w:val="left"/>
       </w:pPr>
-      <w:bookmarkStart w:id="14" w:name="_Toc242295009"/>
+      <w:bookmarkStart w:id="14" w:name="_Toc242295484"/>
       <w:r>
         <w:t>Resultados vista superior</w:t>
       </w:r>
@@ -20564,10 +20540,10 @@
           <w:noProof/>
         </w:rPr>
         <w:drawing>
-          <wp:inline distT="0" distB="0" distL="0" distR="0" wp14:anchorId="1F4CC4CA" wp14:editId="4C7A88B3">
+          <wp:inline distT="0" distB="0" distL="0" distR="0" wp14:anchorId="2C619028" wp14:editId="45C3489D">
             <wp:extent cx="5612130" cy="2581275"/>
             <wp:effectExtent l="0" t="0" r="7620" b="9525"/>
-            <wp:docPr id="1989780474" name="Imagen 3"/>
+            <wp:docPr id="1601553524" name="Imagen 3"/>
             <wp:cNvGraphicFramePr>
               <a:graphicFrameLocks xmlns:a="http://schemas.openxmlformats.org/drawingml/2006/main" noChangeAspect="1"/>
             </wp:cNvGraphicFramePr>
@@ -20575,7 +20551,7 @@
               <a:graphicData uri="http://schemas.openxmlformats.org/drawingml/2006/picture">
                 <pic:pic xmlns:pic="http://schemas.openxmlformats.org/drawingml/2006/picture">
                   <pic:nvPicPr>
-                    <pic:cNvPr id="1989780474" name=""/>
+                    <pic:cNvPr id="1601553524" name=""/>
                     <pic:cNvPicPr/>
                   </pic:nvPicPr>
                   <pic:blipFill>
@@ -21450,7 +21426,7 @@
         <w:spacing w:before="160" w:after="120"/>
         <w:jc w:val="left"/>
       </w:pPr>
-      <w:bookmarkStart w:id="15" w:name="_Toc242295010"/>
+      <w:bookmarkStart w:id="15" w:name="_Toc242295485"/>
       <w:r>
         <w:t>Resultados vista frontal</w:t>
       </w:r>
@@ -21523,10 +21499,10 @@
           <w:noProof/>
         </w:rPr>
         <w:drawing>
-          <wp:inline distT="0" distB="0" distL="0" distR="0" wp14:anchorId="2D345FA9" wp14:editId="6F05CC46">
+          <wp:inline distT="0" distB="0" distL="0" distR="0" wp14:anchorId="12EA67CA" wp14:editId="5291FDD2">
             <wp:extent cx="3478802" cy="2705735"/>
             <wp:effectExtent l="0" t="0" r="7620" b="0"/>
-            <wp:docPr id="1382713128" name="Imagen 4"/>
+            <wp:docPr id="1949627441" name="Imagen 4"/>
             <wp:cNvGraphicFramePr>
               <a:graphicFrameLocks xmlns:a="http://schemas.openxmlformats.org/drawingml/2006/main" noChangeAspect="1"/>
             </wp:cNvGraphicFramePr>
@@ -21534,7 +21510,7 @@
               <a:graphicData uri="http://schemas.openxmlformats.org/drawingml/2006/picture">
                 <pic:pic xmlns:pic="http://schemas.openxmlformats.org/drawingml/2006/picture">
                   <pic:nvPicPr>
-                    <pic:cNvPr id="1382713128" name=""/>
+                    <pic:cNvPr id="1949627441" name=""/>
                     <pic:cNvPicPr/>
                   </pic:nvPicPr>
                   <pic:blipFill>
@@ -21600,7 +21576,7 @@
         <w:spacing w:before="160" w:after="120"/>
         <w:jc w:val="left"/>
       </w:pPr>
-      <w:bookmarkStart w:id="16" w:name="_Toc242295011"/>
+      <w:bookmarkStart w:id="16" w:name="_Toc242295486"/>
       <w:r>
         <w:t>Caso crítico</w:t>
       </w:r>
@@ -22042,7 +22018,7 @@
         <w:spacing w:before="160" w:after="120"/>
         <w:jc w:val="left"/>
       </w:pPr>
-      <w:bookmarkStart w:id="17" w:name="_Toc242295012"/>
+      <w:bookmarkStart w:id="17" w:name="_Toc242295487"/>
       <w:r>
         <w:t>Gráficas del barrido estático</w:t>
       </w:r>
@@ -22067,10 +22043,10 @@
           <w:noProof/>
         </w:rPr>
         <w:drawing>
-          <wp:inline distT="0" distB="0" distL="0" distR="0" wp14:anchorId="50072E2C" wp14:editId="10ACA229">
+          <wp:inline distT="0" distB="0" distL="0" distR="0" wp14:anchorId="5F791B5C" wp14:editId="5E847D94">
             <wp:extent cx="4489069" cy="2693035"/>
             <wp:effectExtent l="0" t="0" r="6985" b="0"/>
-            <wp:docPr id="1374840075" name="Imagen 5"/>
+            <wp:docPr id="379000230" name="Imagen 5"/>
             <wp:cNvGraphicFramePr>
               <a:graphicFrameLocks xmlns:a="http://schemas.openxmlformats.org/drawingml/2006/main" noChangeAspect="1"/>
             </wp:cNvGraphicFramePr>
@@ -22078,7 +22054,7 @@
               <a:graphicData uri="http://schemas.openxmlformats.org/drawingml/2006/picture">
                 <pic:pic xmlns:pic="http://schemas.openxmlformats.org/drawingml/2006/picture">
                   <pic:nvPicPr>
-                    <pic:cNvPr id="1374840075" name=""/>
+                    <pic:cNvPr id="379000230" name=""/>
                     <pic:cNvPicPr/>
                   </pic:nvPicPr>
                   <pic:blipFill>
@@ -22178,10 +22154,10 @@
           <w:noProof/>
         </w:rPr>
         <w:drawing>
-          <wp:inline distT="0" distB="0" distL="0" distR="0" wp14:anchorId="4028CBB1" wp14:editId="49C85D56">
+          <wp:inline distT="0" distB="0" distL="0" distR="0" wp14:anchorId="14B6AFBA" wp14:editId="42BEC553">
             <wp:extent cx="4489069" cy="2693035"/>
             <wp:effectExtent l="0" t="0" r="6985" b="0"/>
-            <wp:docPr id="1128438667" name="Imagen 6"/>
+            <wp:docPr id="314865733" name="Imagen 6"/>
             <wp:cNvGraphicFramePr>
               <a:graphicFrameLocks xmlns:a="http://schemas.openxmlformats.org/drawingml/2006/main" noChangeAspect="1"/>
             </wp:cNvGraphicFramePr>
@@ -22189,7 +22165,7 @@
               <a:graphicData uri="http://schemas.openxmlformats.org/drawingml/2006/picture">
                 <pic:pic xmlns:pic="http://schemas.openxmlformats.org/drawingml/2006/picture">
                   <pic:nvPicPr>
-                    <pic:cNvPr id="1128438667" name=""/>
+                    <pic:cNvPr id="314865733" name=""/>
                     <pic:cNvPicPr/>
                   </pic:nvPicPr>
                   <pic:blipFill>
@@ -22290,10 +22266,10 @@
         </w:rPr>
         <w:lastRenderedPageBreak/>
         <w:drawing>
-          <wp:inline distT="0" distB="0" distL="0" distR="0" wp14:anchorId="3B9ADE96" wp14:editId="7579EE62">
+          <wp:inline distT="0" distB="0" distL="0" distR="0" wp14:anchorId="0FACCA9E" wp14:editId="520524D7">
             <wp:extent cx="4489069" cy="2693035"/>
             <wp:effectExtent l="0" t="0" r="6985" b="0"/>
-            <wp:docPr id="928351028" name="Imagen 7"/>
+            <wp:docPr id="946284901" name="Imagen 7"/>
             <wp:cNvGraphicFramePr>
               <a:graphicFrameLocks xmlns:a="http://schemas.openxmlformats.org/drawingml/2006/main" noChangeAspect="1"/>
             </wp:cNvGraphicFramePr>
@@ -22301,7 +22277,7 @@
               <a:graphicData uri="http://schemas.openxmlformats.org/drawingml/2006/picture">
                 <pic:pic xmlns:pic="http://schemas.openxmlformats.org/drawingml/2006/picture">
                   <pic:nvPicPr>
-                    <pic:cNvPr id="928351028" name=""/>
+                    <pic:cNvPr id="946284901" name=""/>
                     <pic:cNvPicPr/>
                   </pic:nvPicPr>
                   <pic:blipFill>
@@ -22381,10 +22357,10 @@
           <w:noProof/>
         </w:rPr>
         <w:drawing>
-          <wp:inline distT="0" distB="0" distL="0" distR="0" wp14:anchorId="4ED609E3" wp14:editId="4279EBC7">
+          <wp:inline distT="0" distB="0" distL="0" distR="0" wp14:anchorId="77A2845B" wp14:editId="08134098">
             <wp:extent cx="4489069" cy="2693035"/>
             <wp:effectExtent l="0" t="0" r="6985" b="0"/>
-            <wp:docPr id="629692284" name="Imagen 8"/>
+            <wp:docPr id="110754815" name="Imagen 8"/>
             <wp:cNvGraphicFramePr>
               <a:graphicFrameLocks xmlns:a="http://schemas.openxmlformats.org/drawingml/2006/main" noChangeAspect="1"/>
             </wp:cNvGraphicFramePr>
@@ -22392,7 +22368,7 @@
               <a:graphicData uri="http://schemas.openxmlformats.org/drawingml/2006/picture">
                 <pic:pic xmlns:pic="http://schemas.openxmlformats.org/drawingml/2006/picture">
                   <pic:nvPicPr>
-                    <pic:cNvPr id="629692284" name=""/>
+                    <pic:cNvPr id="110754815" name=""/>
                     <pic:cNvPicPr/>
                   </pic:nvPicPr>
                   <pic:blipFill>
@@ -22473,10 +22449,10 @@
         </w:rPr>
         <w:lastRenderedPageBreak/>
         <w:drawing>
-          <wp:inline distT="0" distB="0" distL="0" distR="0" wp14:anchorId="43F7A46E" wp14:editId="6456CCC4">
+          <wp:inline distT="0" distB="0" distL="0" distR="0" wp14:anchorId="229F6E60" wp14:editId="67CEC802">
             <wp:extent cx="4489069" cy="2693035"/>
             <wp:effectExtent l="0" t="0" r="6985" b="0"/>
-            <wp:docPr id="805966640" name="Imagen 9"/>
+            <wp:docPr id="440484749" name="Imagen 9"/>
             <wp:cNvGraphicFramePr>
               <a:graphicFrameLocks xmlns:a="http://schemas.openxmlformats.org/drawingml/2006/main" noChangeAspect="1"/>
             </wp:cNvGraphicFramePr>
@@ -22484,7 +22460,7 @@
               <a:graphicData uri="http://schemas.openxmlformats.org/drawingml/2006/picture">
                 <pic:pic xmlns:pic="http://schemas.openxmlformats.org/drawingml/2006/picture">
                   <pic:nvPicPr>
-                    <pic:cNvPr id="805966640" name=""/>
+                    <pic:cNvPr id="440484749" name=""/>
                     <pic:cNvPicPr/>
                   </pic:nvPicPr>
                   <pic:blipFill>
@@ -22575,10 +22551,10 @@
           <w:noProof/>
         </w:rPr>
         <w:drawing>
-          <wp:inline distT="0" distB="0" distL="0" distR="0" wp14:anchorId="78D76C1E" wp14:editId="2C672CD4">
+          <wp:inline distT="0" distB="0" distL="0" distR="0" wp14:anchorId="07CAABFB" wp14:editId="5F3F73E7">
             <wp:extent cx="4489069" cy="2693035"/>
             <wp:effectExtent l="0" t="0" r="6985" b="0"/>
-            <wp:docPr id="1804197345" name="Imagen 10"/>
+            <wp:docPr id="252745927" name="Imagen 10"/>
             <wp:cNvGraphicFramePr>
               <a:graphicFrameLocks xmlns:a="http://schemas.openxmlformats.org/drawingml/2006/main" noChangeAspect="1"/>
             </wp:cNvGraphicFramePr>
@@ -22586,7 +22562,7 @@
               <a:graphicData uri="http://schemas.openxmlformats.org/drawingml/2006/picture">
                 <pic:pic xmlns:pic="http://schemas.openxmlformats.org/drawingml/2006/picture">
                   <pic:nvPicPr>
-                    <pic:cNvPr id="1804197345" name=""/>
+                    <pic:cNvPr id="252745927" name=""/>
                     <pic:cNvPicPr/>
                   </pic:nvPicPr>
                   <pic:blipFill>
@@ -22658,10 +22634,10 @@
         </w:rPr>
         <w:lastRenderedPageBreak/>
         <w:drawing>
-          <wp:inline distT="0" distB="0" distL="0" distR="0" wp14:anchorId="4E61BED7" wp14:editId="18CF97F8">
+          <wp:inline distT="0" distB="0" distL="0" distR="0" wp14:anchorId="0BD599C9" wp14:editId="7F1B3A21">
             <wp:extent cx="5612130" cy="2357120"/>
             <wp:effectExtent l="0" t="0" r="7620" b="5080"/>
-            <wp:docPr id="830552614" name="Imagen 11"/>
+            <wp:docPr id="750022960" name="Imagen 11"/>
             <wp:cNvGraphicFramePr>
               <a:graphicFrameLocks xmlns:a="http://schemas.openxmlformats.org/drawingml/2006/main" noChangeAspect="1"/>
             </wp:cNvGraphicFramePr>
@@ -22669,7 +22645,7 @@
               <a:graphicData uri="http://schemas.openxmlformats.org/drawingml/2006/picture">
                 <pic:pic xmlns:pic="http://schemas.openxmlformats.org/drawingml/2006/picture">
                   <pic:nvPicPr>
-                    <pic:cNvPr id="830552614" name=""/>
+                    <pic:cNvPr id="750022960" name=""/>
                     <pic:cNvPicPr/>
                   </pic:nvPicPr>
                   <pic:blipFill>
@@ -22740,10 +22716,10 @@
           <w:noProof/>
         </w:rPr>
         <w:drawing>
-          <wp:inline distT="0" distB="0" distL="0" distR="0" wp14:anchorId="390FFFEA" wp14:editId="0C93AFE5">
+          <wp:inline distT="0" distB="0" distL="0" distR="0" wp14:anchorId="1946ADF1" wp14:editId="69BC7D2E">
             <wp:extent cx="5612130" cy="2357120"/>
             <wp:effectExtent l="0" t="0" r="7620" b="5080"/>
-            <wp:docPr id="603888850" name="Imagen 12"/>
+            <wp:docPr id="1246765448" name="Imagen 12"/>
             <wp:cNvGraphicFramePr>
               <a:graphicFrameLocks xmlns:a="http://schemas.openxmlformats.org/drawingml/2006/main" noChangeAspect="1"/>
             </wp:cNvGraphicFramePr>
@@ -22751,7 +22727,7 @@
               <a:graphicData uri="http://schemas.openxmlformats.org/drawingml/2006/picture">
                 <pic:pic xmlns:pic="http://schemas.openxmlformats.org/drawingml/2006/picture">
                   <pic:nvPicPr>
-                    <pic:cNvPr id="603888850" name=""/>
+                    <pic:cNvPr id="1246765448" name=""/>
                     <pic:cNvPicPr/>
                   </pic:nvPicPr>
                   <pic:blipFill>
@@ -22823,10 +22799,10 @@
         </w:rPr>
         <w:lastRenderedPageBreak/>
         <w:drawing>
-          <wp:inline distT="0" distB="0" distL="0" distR="0" wp14:anchorId="4A7EB863" wp14:editId="6AC46CED">
+          <wp:inline distT="0" distB="0" distL="0" distR="0" wp14:anchorId="7982B83F" wp14:editId="3C0D6A86">
             <wp:extent cx="5612130" cy="2357120"/>
             <wp:effectExtent l="0" t="0" r="7620" b="5080"/>
-            <wp:docPr id="730197086" name="Imagen 13"/>
+            <wp:docPr id="1516936341" name="Imagen 13"/>
             <wp:cNvGraphicFramePr>
               <a:graphicFrameLocks xmlns:a="http://schemas.openxmlformats.org/drawingml/2006/main" noChangeAspect="1"/>
             </wp:cNvGraphicFramePr>
@@ -22834,7 +22810,7 @@
               <a:graphicData uri="http://schemas.openxmlformats.org/drawingml/2006/picture">
                 <pic:pic xmlns:pic="http://schemas.openxmlformats.org/drawingml/2006/picture">
                   <pic:nvPicPr>
-                    <pic:cNvPr id="730197086" name=""/>
+                    <pic:cNvPr id="1516936341" name=""/>
                     <pic:cNvPicPr/>
                   </pic:nvPicPr>
                   <pic:blipFill>
@@ -22932,10 +22908,10 @@
           <w:noProof/>
         </w:rPr>
         <w:drawing>
-          <wp:inline distT="0" distB="0" distL="0" distR="0" wp14:anchorId="24ADF22E" wp14:editId="64DC1953">
+          <wp:inline distT="0" distB="0" distL="0" distR="0" wp14:anchorId="63B69CA3" wp14:editId="28CC2DFF">
             <wp:extent cx="4770311" cy="2504440"/>
             <wp:effectExtent l="0" t="0" r="0" b="0"/>
-            <wp:docPr id="1287064911" name="Imagen 14"/>
+            <wp:docPr id="2055206402" name="Imagen 14"/>
             <wp:cNvGraphicFramePr>
               <a:graphicFrameLocks xmlns:a="http://schemas.openxmlformats.org/drawingml/2006/main" noChangeAspect="1"/>
             </wp:cNvGraphicFramePr>
@@ -22943,7 +22919,7 @@
               <a:graphicData uri="http://schemas.openxmlformats.org/drawingml/2006/picture">
                 <pic:pic xmlns:pic="http://schemas.openxmlformats.org/drawingml/2006/picture">
                   <pic:nvPicPr>
-                    <pic:cNvPr id="1287064911" name=""/>
+                    <pic:cNvPr id="2055206402" name=""/>
                     <pic:cNvPicPr/>
                   </pic:nvPicPr>
                   <pic:blipFill>
@@ -23009,7 +22985,7 @@
         <w:spacing w:before="160" w:after="120"/>
         <w:jc w:val="left"/>
       </w:pPr>
-      <w:bookmarkStart w:id="18" w:name="_Toc242295013"/>
+      <w:bookmarkStart w:id="18" w:name="_Toc242295488"/>
       <w:r>
         <w:t>Análisis de resultados estáticos</w:t>
       </w:r>
@@ -23078,7 +23054,7 @@
         <w:spacing w:before="160" w:after="120"/>
         <w:jc w:val="left"/>
       </w:pPr>
-      <w:bookmarkStart w:id="19" w:name="_Toc242295014"/>
+      <w:bookmarkStart w:id="19" w:name="_Toc242295489"/>
       <w:r>
         <w:t>Caso de diseño 2: objeto de 3.5 kg y μ = 0.3</w:t>
       </w:r>
@@ -23098,7 +23074,7 @@
         <w:spacing w:before="160" w:after="120"/>
         <w:jc w:val="left"/>
       </w:pPr>
-      <w:bookmarkStart w:id="20" w:name="_Toc242295015"/>
+      <w:bookmarkStart w:id="20" w:name="_Toc242295490"/>
       <w:r>
         <w:t>Metodología</w:t>
       </w:r>
@@ -23917,7 +23893,7 @@
           <w:rFonts w:eastAsiaTheme="minorEastAsia"/>
         </w:rPr>
       </w:pPr>
-      <w:bookmarkStart w:id="21" w:name="_Toc242295016"/>
+      <w:bookmarkStart w:id="21" w:name="_Toc242295491"/>
       <w:r>
         <w:rPr>
           <w:rFonts w:eastAsiaTheme="minorEastAsia"/>
@@ -25032,10 +25008,10 @@
           <w:noProof/>
         </w:rPr>
         <w:drawing>
-          <wp:inline distT="0" distB="0" distL="0" distR="0" wp14:anchorId="3305C103" wp14:editId="6F4C801F">
+          <wp:inline distT="0" distB="0" distL="0" distR="0" wp14:anchorId="4600A484" wp14:editId="2810D51B">
             <wp:extent cx="5612130" cy="2142490"/>
             <wp:effectExtent l="0" t="0" r="7620" b="0"/>
-            <wp:docPr id="1665564883" name="Imagen 15"/>
+            <wp:docPr id="142268436" name="Imagen 15"/>
             <wp:cNvGraphicFramePr>
               <a:graphicFrameLocks xmlns:a="http://schemas.openxmlformats.org/drawingml/2006/main" noChangeAspect="1"/>
             </wp:cNvGraphicFramePr>
@@ -25043,7 +25019,7 @@
               <a:graphicData uri="http://schemas.openxmlformats.org/drawingml/2006/picture">
                 <pic:pic xmlns:pic="http://schemas.openxmlformats.org/drawingml/2006/picture">
                   <pic:nvPicPr>
-                    <pic:cNvPr id="1665564883" name=""/>
+                    <pic:cNvPr id="142268436" name=""/>
                     <pic:cNvPicPr/>
                   </pic:nvPicPr>
                   <pic:blipFill>
@@ -25115,10 +25091,10 @@
         </w:rPr>
         <w:lastRenderedPageBreak/>
         <w:drawing>
-          <wp:inline distT="0" distB="0" distL="0" distR="0" wp14:anchorId="39AFDADA" wp14:editId="1CF14764">
+          <wp:inline distT="0" distB="0" distL="0" distR="0" wp14:anchorId="101D6EAD" wp14:editId="0F721EB6">
             <wp:extent cx="5612130" cy="2142490"/>
             <wp:effectExtent l="0" t="0" r="7620" b="0"/>
-            <wp:docPr id="484708816" name="Imagen 16"/>
+            <wp:docPr id="126854520" name="Imagen 16"/>
             <wp:cNvGraphicFramePr>
               <a:graphicFrameLocks xmlns:a="http://schemas.openxmlformats.org/drawingml/2006/main" noChangeAspect="1"/>
             </wp:cNvGraphicFramePr>
@@ -25126,7 +25102,7 @@
               <a:graphicData uri="http://schemas.openxmlformats.org/drawingml/2006/picture">
                 <pic:pic xmlns:pic="http://schemas.openxmlformats.org/drawingml/2006/picture">
                   <pic:nvPicPr>
-                    <pic:cNvPr id="484708816" name=""/>
+                    <pic:cNvPr id="126854520" name=""/>
                     <pic:cNvPicPr/>
                   </pic:nvPicPr>
                   <pic:blipFill>
@@ -25201,7 +25177,7 @@
         <w:spacing w:before="160" w:after="120"/>
         <w:jc w:val="left"/>
       </w:pPr>
-      <w:bookmarkStart w:id="22" w:name="_Toc242295017"/>
+      <w:bookmarkStart w:id="22" w:name="_Toc242295492"/>
       <w:r>
         <w:t>Vistas lateral, superior y frontal</w:t>
       </w:r>
@@ -25218,10 +25194,10 @@
           <w:noProof/>
         </w:rPr>
         <w:drawing>
-          <wp:inline distT="0" distB="0" distL="0" distR="0" wp14:anchorId="497325CB" wp14:editId="67B81B04">
+          <wp:inline distT="0" distB="0" distL="0" distR="0" wp14:anchorId="375EE1E2" wp14:editId="6D3E7096">
             <wp:extent cx="3086100" cy="3086100"/>
             <wp:effectExtent l="0" t="0" r="0" b="0"/>
-            <wp:docPr id="1854185067" name="Imagen 17"/>
+            <wp:docPr id="1568094132" name="Imagen 17"/>
             <wp:cNvGraphicFramePr>
               <a:graphicFrameLocks xmlns:a="http://schemas.openxmlformats.org/drawingml/2006/main" noChangeAspect="1"/>
             </wp:cNvGraphicFramePr>
@@ -25229,7 +25205,7 @@
               <a:graphicData uri="http://schemas.openxmlformats.org/drawingml/2006/picture">
                 <pic:pic xmlns:pic="http://schemas.openxmlformats.org/drawingml/2006/picture">
                   <pic:nvPicPr>
-                    <pic:cNvPr id="1854185067" name=""/>
+                    <pic:cNvPr id="1568094132" name=""/>
                     <pic:cNvPicPr/>
                   </pic:nvPicPr>
                   <pic:blipFill>
@@ -26543,10 +26519,10 @@
           <w:noProof/>
         </w:rPr>
         <w:drawing>
-          <wp:inline distT="0" distB="0" distL="0" distR="0" wp14:anchorId="67AEBBD3" wp14:editId="66B5CE4C">
+          <wp:inline distT="0" distB="0" distL="0" distR="0" wp14:anchorId="3FDD3C19" wp14:editId="35FE0624">
             <wp:extent cx="5612130" cy="2550795"/>
             <wp:effectExtent l="0" t="0" r="7620" b="1905"/>
-            <wp:docPr id="1847175210" name="Imagen 18"/>
+            <wp:docPr id="1626378779" name="Imagen 18"/>
             <wp:cNvGraphicFramePr>
               <a:graphicFrameLocks xmlns:a="http://schemas.openxmlformats.org/drawingml/2006/main" noChangeAspect="1"/>
             </wp:cNvGraphicFramePr>
@@ -26554,7 +26530,7 @@
               <a:graphicData uri="http://schemas.openxmlformats.org/drawingml/2006/picture">
                 <pic:pic xmlns:pic="http://schemas.openxmlformats.org/drawingml/2006/picture">
                   <pic:nvPicPr>
-                    <pic:cNvPr id="1847175210" name=""/>
+                    <pic:cNvPr id="1626378779" name=""/>
                     <pic:cNvPicPr/>
                   </pic:nvPicPr>
                   <pic:blipFill>
@@ -27208,10 +27184,10 @@
           <w:noProof/>
         </w:rPr>
         <w:drawing>
-          <wp:inline distT="0" distB="0" distL="0" distR="0" wp14:anchorId="02F97545" wp14:editId="65F79902">
+          <wp:inline distT="0" distB="0" distL="0" distR="0" wp14:anchorId="6AEB9EDA" wp14:editId="169D9230">
             <wp:extent cx="3478802" cy="2705735"/>
             <wp:effectExtent l="0" t="0" r="7620" b="0"/>
-            <wp:docPr id="453753251" name="Imagen 19"/>
+            <wp:docPr id="431625483" name="Imagen 19"/>
             <wp:cNvGraphicFramePr>
               <a:graphicFrameLocks xmlns:a="http://schemas.openxmlformats.org/drawingml/2006/main" noChangeAspect="1"/>
             </wp:cNvGraphicFramePr>
@@ -27219,7 +27195,7 @@
               <a:graphicData uri="http://schemas.openxmlformats.org/drawingml/2006/picture">
                 <pic:pic xmlns:pic="http://schemas.openxmlformats.org/drawingml/2006/picture">
                   <pic:nvPicPr>
-                    <pic:cNvPr id="453753251" name=""/>
+                    <pic:cNvPr id="431625483" name=""/>
                     <pic:cNvPicPr/>
                   </pic:nvPicPr>
                   <pic:blipFill>
@@ -27317,7 +27293,7 @@
         <w:spacing w:before="160" w:after="120"/>
         <w:jc w:val="left"/>
       </w:pPr>
-      <w:bookmarkStart w:id="23" w:name="_Toc242295018"/>
+      <w:bookmarkStart w:id="23" w:name="_Toc242295493"/>
       <w:r>
         <w:t>Estática del dedo por tipo de agarre</w:t>
       </w:r>
@@ -28161,10 +28137,10 @@
           <w:noProof/>
         </w:rPr>
         <w:drawing>
-          <wp:inline distT="0" distB="0" distL="0" distR="0" wp14:anchorId="66E153EA" wp14:editId="1F4CF249">
+          <wp:inline distT="0" distB="0" distL="0" distR="0" wp14:anchorId="7974C210" wp14:editId="4BA1BB5C">
             <wp:extent cx="5612130" cy="3367405"/>
             <wp:effectExtent l="0" t="0" r="7620" b="4445"/>
-            <wp:docPr id="968100503" name="Imagen 20"/>
+            <wp:docPr id="855649389" name="Imagen 20"/>
             <wp:cNvGraphicFramePr>
               <a:graphicFrameLocks xmlns:a="http://schemas.openxmlformats.org/drawingml/2006/main" noChangeAspect="1"/>
             </wp:cNvGraphicFramePr>
@@ -28172,7 +28148,7 @@
               <a:graphicData uri="http://schemas.openxmlformats.org/drawingml/2006/picture">
                 <pic:pic xmlns:pic="http://schemas.openxmlformats.org/drawingml/2006/picture">
                   <pic:nvPicPr>
-                    <pic:cNvPr id="968100503" name=""/>
+                    <pic:cNvPr id="855649389" name=""/>
                     <pic:cNvPicPr/>
                   </pic:nvPicPr>
                   <pic:blipFill>
@@ -29075,7 +29051,7 @@
         <w:spacing w:before="160" w:after="120"/>
         <w:jc w:val="left"/>
       </w:pPr>
-      <w:bookmarkStart w:id="24" w:name="_Toc242295019"/>
+      <w:bookmarkStart w:id="24" w:name="_Toc242295494"/>
       <w:r>
         <w:t>Cargas internas</w:t>
       </w:r>
@@ -29092,10 +29068,10 @@
           <w:noProof/>
         </w:rPr>
         <w:drawing>
-          <wp:inline distT="0" distB="0" distL="0" distR="0" wp14:anchorId="29BE0DE3" wp14:editId="2EB2E020">
+          <wp:inline distT="0" distB="0" distL="0" distR="0" wp14:anchorId="1A8F99D6" wp14:editId="2FC24A1B">
             <wp:extent cx="5612130" cy="3571240"/>
             <wp:effectExtent l="0" t="0" r="7620" b="0"/>
-            <wp:docPr id="923662878" name="Imagen 21"/>
+            <wp:docPr id="866392869" name="Imagen 21"/>
             <wp:cNvGraphicFramePr>
               <a:graphicFrameLocks xmlns:a="http://schemas.openxmlformats.org/drawingml/2006/main" noChangeAspect="1"/>
             </wp:cNvGraphicFramePr>
@@ -29103,7 +29079,7 @@
               <a:graphicData uri="http://schemas.openxmlformats.org/drawingml/2006/picture">
                 <pic:pic xmlns:pic="http://schemas.openxmlformats.org/drawingml/2006/picture">
                   <pic:nvPicPr>
-                    <pic:cNvPr id="923662878" name=""/>
+                    <pic:cNvPr id="866392869" name=""/>
                     <pic:cNvPicPr/>
                   </pic:nvPicPr>
                   <pic:blipFill>
@@ -29194,10 +29170,10 @@
           <w:noProof/>
         </w:rPr>
         <w:drawing>
-          <wp:inline distT="0" distB="0" distL="0" distR="0" wp14:anchorId="62AA61AF" wp14:editId="2164AFA4">
+          <wp:inline distT="0" distB="0" distL="0" distR="0" wp14:anchorId="7A3C79EA" wp14:editId="7A2670CC">
             <wp:extent cx="5612130" cy="2142490"/>
             <wp:effectExtent l="0" t="0" r="7620" b="0"/>
-            <wp:docPr id="2102953664" name="Imagen 22"/>
+            <wp:docPr id="1752009807" name="Imagen 22"/>
             <wp:cNvGraphicFramePr>
               <a:graphicFrameLocks xmlns:a="http://schemas.openxmlformats.org/drawingml/2006/main" noChangeAspect="1"/>
             </wp:cNvGraphicFramePr>
@@ -29205,7 +29181,7 @@
               <a:graphicData uri="http://schemas.openxmlformats.org/drawingml/2006/picture">
                 <pic:pic xmlns:pic="http://schemas.openxmlformats.org/drawingml/2006/picture">
                   <pic:nvPicPr>
-                    <pic:cNvPr id="2102953664" name=""/>
+                    <pic:cNvPr id="1752009807" name=""/>
                     <pic:cNvPicPr/>
                   </pic:nvPicPr>
                   <pic:blipFill>
@@ -29272,7 +29248,7 @@
         <w:spacing w:before="160" w:after="120"/>
         <w:jc w:val="left"/>
       </w:pPr>
-      <w:bookmarkStart w:id="25" w:name="_Toc242295020"/>
+      <w:bookmarkStart w:id="25" w:name="_Toc242295495"/>
       <w:r>
         <w:t>Validación en Working Model 2D</w:t>
       </w:r>
@@ -29297,10 +29273,10 @@
           <w:noProof/>
         </w:rPr>
         <w:drawing>
-          <wp:inline distT="0" distB="0" distL="0" distR="0" wp14:anchorId="714E595F" wp14:editId="0B0D899B">
+          <wp:inline distT="0" distB="0" distL="0" distR="0" wp14:anchorId="3C2CB7E6" wp14:editId="4CEB4E44">
             <wp:extent cx="5612130" cy="3470275"/>
             <wp:effectExtent l="0" t="0" r="7620" b="0"/>
-            <wp:docPr id="734550408" name="Imagen 23"/>
+            <wp:docPr id="947717176" name="Imagen 23"/>
             <wp:cNvGraphicFramePr>
               <a:graphicFrameLocks xmlns:a="http://schemas.openxmlformats.org/drawingml/2006/main" noChangeAspect="1"/>
             </wp:cNvGraphicFramePr>
@@ -29308,7 +29284,7 @@
               <a:graphicData uri="http://schemas.openxmlformats.org/drawingml/2006/picture">
                 <pic:pic xmlns:pic="http://schemas.openxmlformats.org/drawingml/2006/picture">
                   <pic:nvPicPr>
-                    <pic:cNvPr id="734550408" name=""/>
+                    <pic:cNvPr id="947717176" name=""/>
                     <pic:cNvPicPr/>
                   </pic:nvPicPr>
                   <pic:blipFill>
@@ -29374,7 +29350,7 @@
         <w:spacing w:before="160" w:after="120"/>
         <w:jc w:val="left"/>
       </w:pPr>
-      <w:bookmarkStart w:id="26" w:name="_Toc242295021"/>
+      <w:bookmarkStart w:id="26" w:name="_Toc242295496"/>
       <w:r>
         <w:t>Análisis del caso de diseño 2</w:t>
       </w:r>
@@ -29443,7 +29419,7 @@
         <w:spacing w:before="240" w:after="120"/>
         <w:jc w:val="left"/>
       </w:pPr>
-      <w:bookmarkStart w:id="27" w:name="_Toc242295022"/>
+      <w:bookmarkStart w:id="27" w:name="_Toc242295497"/>
       <w:r>
         <w:lastRenderedPageBreak/>
         <w:t>Cálculos cinemáticos (3.3)</w:t>
@@ -29456,7 +29432,7 @@
         <w:spacing w:before="160" w:after="120"/>
         <w:jc w:val="left"/>
       </w:pPr>
-      <w:bookmarkStart w:id="28" w:name="_Toc242295023"/>
+      <w:bookmarkStart w:id="28" w:name="_Toc242295498"/>
       <w:r>
         <w:t>Descripción</w:t>
       </w:r>
@@ -29508,7 +29484,7 @@
         <w:spacing w:before="160" w:after="120"/>
         <w:jc w:val="left"/>
       </w:pPr>
-      <w:bookmarkStart w:id="29" w:name="_Toc242295024"/>
+      <w:bookmarkStart w:id="29" w:name="_Toc242295499"/>
       <w:r>
         <w:t>Objetivo de cálculo</w:t>
       </w:r>
@@ -29562,7 +29538,7 @@
         <w:spacing w:before="160" w:after="120"/>
         <w:jc w:val="left"/>
       </w:pPr>
-      <w:bookmarkStart w:id="30" w:name="_Toc242295025"/>
+      <w:bookmarkStart w:id="30" w:name="_Toc242295500"/>
       <w:r>
         <w:t>Modelo de cálculo</w:t>
       </w:r>
@@ -30558,10 +30534,10 @@
         </w:rPr>
         <w:lastRenderedPageBreak/>
         <w:drawing>
-          <wp:inline distT="0" distB="0" distL="0" distR="0" wp14:anchorId="1CD11C2E" wp14:editId="2FC09B2B">
+          <wp:inline distT="0" distB="0" distL="0" distR="0" wp14:anchorId="3435FC98" wp14:editId="369D55A4">
             <wp:extent cx="5612130" cy="3155315"/>
             <wp:effectExtent l="0" t="0" r="7620" b="6985"/>
-            <wp:docPr id="166252850" name="Imagen 24"/>
+            <wp:docPr id="1571228739" name="Imagen 24"/>
             <wp:cNvGraphicFramePr>
               <a:graphicFrameLocks xmlns:a="http://schemas.openxmlformats.org/drawingml/2006/main" noChangeAspect="1"/>
             </wp:cNvGraphicFramePr>
@@ -30569,7 +30545,7 @@
               <a:graphicData uri="http://schemas.openxmlformats.org/drawingml/2006/picture">
                 <pic:pic xmlns:pic="http://schemas.openxmlformats.org/drawingml/2006/picture">
                   <pic:nvPicPr>
-                    <pic:cNvPr id="166252850" name=""/>
+                    <pic:cNvPr id="1571228739" name=""/>
                     <pic:cNvPicPr/>
                   </pic:nvPicPr>
                   <pic:blipFill>
@@ -30686,7 +30662,7 @@
         <w:spacing w:before="160" w:after="120"/>
         <w:jc w:val="left"/>
       </w:pPr>
-      <w:bookmarkStart w:id="31" w:name="_Toc242295026"/>
+      <w:bookmarkStart w:id="31" w:name="_Toc242295501"/>
       <w:r>
         <w:t>Valores del modelo de cálculo</w:t>
       </w:r>
@@ -30722,7 +30698,7 @@
         <w:spacing w:before="160" w:after="120"/>
         <w:jc w:val="left"/>
       </w:pPr>
-      <w:bookmarkStart w:id="32" w:name="_Toc242295027"/>
+      <w:bookmarkStart w:id="32" w:name="_Toc242295502"/>
       <w:r>
         <w:t>Resultados</w:t>
       </w:r>
@@ -30739,10 +30715,10 @@
           <w:noProof/>
         </w:rPr>
         <w:drawing>
-          <wp:inline distT="0" distB="0" distL="0" distR="0" wp14:anchorId="4A67B6BE" wp14:editId="35C05D1B">
+          <wp:inline distT="0" distB="0" distL="0" distR="0" wp14:anchorId="66DC0542" wp14:editId="71B13724">
             <wp:extent cx="5612130" cy="1683385"/>
             <wp:effectExtent l="0" t="0" r="7620" b="0"/>
-            <wp:docPr id="884918998" name="Imagen 25"/>
+            <wp:docPr id="1423867522" name="Imagen 25"/>
             <wp:cNvGraphicFramePr>
               <a:graphicFrameLocks xmlns:a="http://schemas.openxmlformats.org/drawingml/2006/main" noChangeAspect="1"/>
             </wp:cNvGraphicFramePr>
@@ -30750,7 +30726,7 @@
               <a:graphicData uri="http://schemas.openxmlformats.org/drawingml/2006/picture">
                 <pic:pic xmlns:pic="http://schemas.openxmlformats.org/drawingml/2006/picture">
                   <pic:nvPicPr>
-                    <pic:cNvPr id="884918998" name=""/>
+                    <pic:cNvPr id="1423867522" name=""/>
                     <pic:cNvPicPr/>
                   </pic:nvPicPr>
                   <pic:blipFill>
@@ -30831,10 +30807,10 @@
         </w:rPr>
         <w:lastRenderedPageBreak/>
         <w:drawing>
-          <wp:inline distT="0" distB="0" distL="0" distR="0" wp14:anchorId="58F4DC63" wp14:editId="6CD15540">
+          <wp:inline distT="0" distB="0" distL="0" distR="0" wp14:anchorId="2DF2A6F2" wp14:editId="12FF92D8">
             <wp:extent cx="5612130" cy="1938655"/>
             <wp:effectExtent l="0" t="0" r="7620" b="4445"/>
-            <wp:docPr id="1738643500" name="Imagen 26"/>
+            <wp:docPr id="1337204987" name="Imagen 26"/>
             <wp:cNvGraphicFramePr>
               <a:graphicFrameLocks xmlns:a="http://schemas.openxmlformats.org/drawingml/2006/main" noChangeAspect="1"/>
             </wp:cNvGraphicFramePr>
@@ -30842,7 +30818,7 @@
               <a:graphicData uri="http://schemas.openxmlformats.org/drawingml/2006/picture">
                 <pic:pic xmlns:pic="http://schemas.openxmlformats.org/drawingml/2006/picture">
                   <pic:nvPicPr>
-                    <pic:cNvPr id="1738643500" name=""/>
+                    <pic:cNvPr id="1337204987" name=""/>
                     <pic:cNvPicPr/>
                   </pic:nvPicPr>
                   <pic:blipFill>
@@ -30960,10 +30936,10 @@
           <w:noProof/>
         </w:rPr>
         <w:drawing>
-          <wp:inline distT="0" distB="0" distL="0" distR="0" wp14:anchorId="29F8AAA5" wp14:editId="0BCDAF78">
+          <wp:inline distT="0" distB="0" distL="0" distR="0" wp14:anchorId="3D851125" wp14:editId="4354459E">
             <wp:extent cx="3086100" cy="3086100"/>
             <wp:effectExtent l="0" t="0" r="0" b="0"/>
-            <wp:docPr id="301442899" name="Imagen 27"/>
+            <wp:docPr id="294526893" name="Imagen 27"/>
             <wp:cNvGraphicFramePr>
               <a:graphicFrameLocks xmlns:a="http://schemas.openxmlformats.org/drawingml/2006/main" noChangeAspect="1"/>
             </wp:cNvGraphicFramePr>
@@ -30971,7 +30947,7 @@
               <a:graphicData uri="http://schemas.openxmlformats.org/drawingml/2006/picture">
                 <pic:pic xmlns:pic="http://schemas.openxmlformats.org/drawingml/2006/picture">
                   <pic:nvPicPr>
-                    <pic:cNvPr id="301442899" name=""/>
+                    <pic:cNvPr id="294526893" name=""/>
                     <pic:cNvPicPr/>
                   </pic:nvPicPr>
                   <pic:blipFill>
@@ -34879,7 +34855,7 @@
         <w:spacing w:before="160" w:after="120"/>
         <w:jc w:val="left"/>
       </w:pPr>
-      <w:bookmarkStart w:id="33" w:name="_Toc242295028"/>
+      <w:bookmarkStart w:id="33" w:name="_Toc242295503"/>
       <w:r>
         <w:t>Análisis de resultados cinemáticos</w:t>
       </w:r>
@@ -35016,7 +34992,7 @@
         <w:spacing w:before="240" w:after="120"/>
         <w:jc w:val="left"/>
       </w:pPr>
-      <w:bookmarkStart w:id="34" w:name="_Toc242295029"/>
+      <w:bookmarkStart w:id="34" w:name="_Toc242295504"/>
       <w:r>
         <w:lastRenderedPageBreak/>
         <w:t>Cálculos dinámicos (3.4)</w:t>
@@ -35029,7 +35005,7 @@
         <w:spacing w:before="160" w:after="120"/>
         <w:jc w:val="left"/>
       </w:pPr>
-      <w:bookmarkStart w:id="35" w:name="_Toc242295030"/>
+      <w:bookmarkStart w:id="35" w:name="_Toc242295505"/>
       <w:r>
         <w:t>Descripción</w:t>
       </w:r>
@@ -35049,7 +35025,7 @@
         <w:spacing w:before="160" w:after="120"/>
         <w:jc w:val="left"/>
       </w:pPr>
-      <w:bookmarkStart w:id="36" w:name="_Toc242295031"/>
+      <w:bookmarkStart w:id="36" w:name="_Toc242295506"/>
       <w:r>
         <w:t>Objetivo de cálculo</w:t>
       </w:r>
@@ -35103,7 +35079,7 @@
         <w:spacing w:before="160" w:after="120"/>
         <w:jc w:val="left"/>
       </w:pPr>
-      <w:bookmarkStart w:id="37" w:name="_Toc242295032"/>
+      <w:bookmarkStart w:id="37" w:name="_Toc242295507"/>
       <w:r>
         <w:t>Modelo de cálculo</w:t>
       </w:r>
@@ -36318,10 +36294,10 @@
         </w:rPr>
         <w:lastRenderedPageBreak/>
         <w:drawing>
-          <wp:inline distT="0" distB="0" distL="0" distR="0" wp14:anchorId="7215BAF4" wp14:editId="256416DC">
+          <wp:inline distT="0" distB="0" distL="0" distR="0" wp14:anchorId="31FC11D1" wp14:editId="085BC2FE">
             <wp:extent cx="5612130" cy="3158490"/>
             <wp:effectExtent l="0" t="0" r="7620" b="3810"/>
-            <wp:docPr id="1040498899" name="Imagen 28"/>
+            <wp:docPr id="49064059" name="Imagen 28"/>
             <wp:cNvGraphicFramePr>
               <a:graphicFrameLocks xmlns:a="http://schemas.openxmlformats.org/drawingml/2006/main" noChangeAspect="1"/>
             </wp:cNvGraphicFramePr>
@@ -36329,7 +36305,7 @@
               <a:graphicData uri="http://schemas.openxmlformats.org/drawingml/2006/picture">
                 <pic:pic xmlns:pic="http://schemas.openxmlformats.org/drawingml/2006/picture">
                   <pic:nvPicPr>
-                    <pic:cNvPr id="1040498899" name=""/>
+                    <pic:cNvPr id="49064059" name=""/>
                     <pic:cNvPicPr/>
                   </pic:nvPicPr>
                   <pic:blipFill>
@@ -36433,7 +36409,7 @@
         <w:spacing w:before="160" w:after="120"/>
         <w:jc w:val="left"/>
       </w:pPr>
-      <w:bookmarkStart w:id="38" w:name="_Toc242295033"/>
+      <w:bookmarkStart w:id="38" w:name="_Toc242295508"/>
       <w:r>
         <w:t>Resultados</w:t>
       </w:r>
@@ -36450,10 +36426,10 @@
           <w:noProof/>
         </w:rPr>
         <w:drawing>
-          <wp:inline distT="0" distB="0" distL="0" distR="0" wp14:anchorId="426CE8EF" wp14:editId="3ACEAA32">
+          <wp:inline distT="0" distB="0" distL="0" distR="0" wp14:anchorId="4E11DB4E" wp14:editId="5D6F0D3D">
             <wp:extent cx="5612130" cy="1938655"/>
             <wp:effectExtent l="0" t="0" r="7620" b="4445"/>
-            <wp:docPr id="648242302" name="Imagen 29"/>
+            <wp:docPr id="768922624" name="Imagen 29"/>
             <wp:cNvGraphicFramePr>
               <a:graphicFrameLocks xmlns:a="http://schemas.openxmlformats.org/drawingml/2006/main" noChangeAspect="1"/>
             </wp:cNvGraphicFramePr>
@@ -36461,7 +36437,7 @@
               <a:graphicData uri="http://schemas.openxmlformats.org/drawingml/2006/picture">
                 <pic:pic xmlns:pic="http://schemas.openxmlformats.org/drawingml/2006/picture">
                   <pic:nvPicPr>
-                    <pic:cNvPr id="648242302" name=""/>
+                    <pic:cNvPr id="768922624" name=""/>
                     <pic:cNvPicPr/>
                   </pic:nvPicPr>
                   <pic:blipFill>
@@ -37483,7 +37459,7 @@
         <w:spacing w:before="160" w:after="120"/>
         <w:jc w:val="left"/>
       </w:pPr>
-      <w:bookmarkStart w:id="39" w:name="_Toc242295034"/>
+      <w:bookmarkStart w:id="39" w:name="_Toc242295509"/>
       <w:r>
         <w:t>Energía por ciclo completo</w:t>
       </w:r>
@@ -38567,7 +38543,7 @@
         <w:spacing w:before="160" w:after="120"/>
         <w:jc w:val="left"/>
       </w:pPr>
-      <w:bookmarkStart w:id="40" w:name="_Toc242295035"/>
+      <w:bookmarkStart w:id="40" w:name="_Toc242295510"/>
       <w:r>
         <w:t>Consumo durante la retención</w:t>
       </w:r>
@@ -38688,7 +38664,7 @@
         <w:spacing w:before="160" w:after="120"/>
         <w:jc w:val="left"/>
       </w:pPr>
-      <w:bookmarkStart w:id="41" w:name="_Toc242295036"/>
+      <w:bookmarkStart w:id="41" w:name="_Toc242295511"/>
       <w:r>
         <w:lastRenderedPageBreak/>
         <w:t>Consumo eléctrico con motores típicos</w:t>
@@ -40464,10 +40440,10 @@
         </w:rPr>
         <w:lastRenderedPageBreak/>
         <w:drawing>
-          <wp:inline distT="0" distB="0" distL="0" distR="0" wp14:anchorId="5E307DF2" wp14:editId="0A5004A3">
+          <wp:inline distT="0" distB="0" distL="0" distR="0" wp14:anchorId="6DF348FD" wp14:editId="001269BC">
             <wp:extent cx="5612130" cy="1938655"/>
             <wp:effectExtent l="0" t="0" r="7620" b="4445"/>
-            <wp:docPr id="1072473462" name="Imagen 30"/>
+            <wp:docPr id="221940968" name="Imagen 30"/>
             <wp:cNvGraphicFramePr>
               <a:graphicFrameLocks xmlns:a="http://schemas.openxmlformats.org/drawingml/2006/main" noChangeAspect="1"/>
             </wp:cNvGraphicFramePr>
@@ -40475,7 +40451,7 @@
               <a:graphicData uri="http://schemas.openxmlformats.org/drawingml/2006/picture">
                 <pic:pic xmlns:pic="http://schemas.openxmlformats.org/drawingml/2006/picture">
                   <pic:nvPicPr>
-                    <pic:cNvPr id="1072473462" name=""/>
+                    <pic:cNvPr id="221940968" name=""/>
                     <pic:cNvPicPr/>
                   </pic:nvPicPr>
                   <pic:blipFill>
@@ -43463,7 +43439,7 @@
         <w:spacing w:before="160" w:after="120"/>
         <w:jc w:val="left"/>
       </w:pPr>
-      <w:bookmarkStart w:id="42" w:name="_Toc242295037"/>
+      <w:bookmarkStart w:id="42" w:name="_Toc242295512"/>
       <w:r>
         <w:t>Análisis de resultados dinámicos</w:t>
       </w:r>
@@ -43583,7 +43559,7 @@
         <w:spacing w:before="240" w:after="120"/>
         <w:jc w:val="left"/>
       </w:pPr>
-      <w:bookmarkStart w:id="43" w:name="_Toc242295038"/>
+      <w:bookmarkStart w:id="43" w:name="_Toc242295513"/>
       <w:r>
         <w:lastRenderedPageBreak/>
         <w:t>Simulación en Working Model 2D</w:t>
@@ -43596,7 +43572,7 @@
         <w:spacing w:before="160" w:after="120"/>
         <w:jc w:val="left"/>
       </w:pPr>
-      <w:bookmarkStart w:id="44" w:name="_Toc242295039"/>
+      <w:bookmarkStart w:id="44" w:name="_Toc242295514"/>
       <w:r>
         <w:t>Modelo estático</w:t>
       </w:r>
@@ -43621,10 +43597,10 @@
           <w:noProof/>
         </w:rPr>
         <w:drawing>
-          <wp:inline distT="0" distB="0" distL="0" distR="0" wp14:anchorId="46BD152A" wp14:editId="6A600825">
+          <wp:inline distT="0" distB="0" distL="0" distR="0" wp14:anchorId="4F945CBB" wp14:editId="45AA54CF">
             <wp:extent cx="4489171" cy="2139950"/>
             <wp:effectExtent l="0" t="0" r="6985" b="0"/>
-            <wp:docPr id="1088131666" name="Imagen 31"/>
+            <wp:docPr id="1526673090" name="Imagen 31"/>
             <wp:cNvGraphicFramePr>
               <a:graphicFrameLocks xmlns:a="http://schemas.openxmlformats.org/drawingml/2006/main" noChangeAspect="1"/>
             </wp:cNvGraphicFramePr>
@@ -43632,7 +43608,7 @@
               <a:graphicData uri="http://schemas.openxmlformats.org/drawingml/2006/picture">
                 <pic:pic xmlns:pic="http://schemas.openxmlformats.org/drawingml/2006/picture">
                   <pic:nvPicPr>
-                    <pic:cNvPr id="1088131666" name=""/>
+                    <pic:cNvPr id="1526673090" name=""/>
                     <pic:cNvPicPr/>
                   </pic:nvPicPr>
                   <pic:blipFill>
@@ -44803,7 +44779,7 @@
         <w:spacing w:before="160" w:after="120"/>
         <w:jc w:val="left"/>
       </w:pPr>
-      <w:bookmarkStart w:id="45" w:name="_Toc242295040"/>
+      <w:bookmarkStart w:id="45" w:name="_Toc242295515"/>
       <w:r>
         <w:t>Pruebas de agarre en el modelo estático</w:t>
       </w:r>
@@ -44848,7 +44824,6 @@
         <w:rPr>
           <w:b/>
         </w:rPr>
-        <w:lastRenderedPageBreak/>
         <w:t xml:space="preserve">Tabla 28. </w:t>
       </w:r>
       <w:r>
@@ -45343,10 +45318,10 @@
           <w:noProof/>
         </w:rPr>
         <w:drawing>
-          <wp:inline distT="0" distB="0" distL="0" distR="0" wp14:anchorId="242B4E9B" wp14:editId="4984E4F2">
+          <wp:inline distT="0" distB="0" distL="0" distR="0" wp14:anchorId="2363A2C8" wp14:editId="5D4D7871">
             <wp:extent cx="5050370" cy="2934335"/>
             <wp:effectExtent l="0" t="0" r="0" b="0"/>
-            <wp:docPr id="1498572729" name="Imagen 32"/>
+            <wp:docPr id="1267114971" name="Imagen 32"/>
             <wp:cNvGraphicFramePr>
               <a:graphicFrameLocks xmlns:a="http://schemas.openxmlformats.org/drawingml/2006/main" noChangeAspect="1"/>
             </wp:cNvGraphicFramePr>
@@ -45354,7 +45329,7 @@
               <a:graphicData uri="http://schemas.openxmlformats.org/drawingml/2006/picture">
                 <pic:pic xmlns:pic="http://schemas.openxmlformats.org/drawingml/2006/picture">
                   <pic:nvPicPr>
-                    <pic:cNvPr id="1498572729" name=""/>
+                    <pic:cNvPr id="1267114971" name=""/>
                     <pic:cNvPicPr/>
                   </pic:nvPicPr>
                   <pic:blipFill>
@@ -45425,10 +45400,10 @@
           <w:noProof/>
         </w:rPr>
         <w:drawing>
-          <wp:inline distT="0" distB="0" distL="0" distR="0" wp14:anchorId="6E6DA64F" wp14:editId="6E04CEF8">
+          <wp:inline distT="0" distB="0" distL="0" distR="0" wp14:anchorId="7DED7140" wp14:editId="324D5F4A">
             <wp:extent cx="5050370" cy="2934335"/>
             <wp:effectExtent l="0" t="0" r="0" b="0"/>
-            <wp:docPr id="1383363658" name="Imagen 33"/>
+            <wp:docPr id="1096086084" name="Imagen 33"/>
             <wp:cNvGraphicFramePr>
               <a:graphicFrameLocks xmlns:a="http://schemas.openxmlformats.org/drawingml/2006/main" noChangeAspect="1"/>
             </wp:cNvGraphicFramePr>
@@ -45436,7 +45411,7 @@
               <a:graphicData uri="http://schemas.openxmlformats.org/drawingml/2006/picture">
                 <pic:pic xmlns:pic="http://schemas.openxmlformats.org/drawingml/2006/picture">
                   <pic:nvPicPr>
-                    <pic:cNvPr id="1383363658" name=""/>
+                    <pic:cNvPr id="1096086084" name=""/>
                     <pic:cNvPicPr/>
                   </pic:nvPicPr>
                   <pic:blipFill>
@@ -45490,7 +45465,6 @@
         <w:rPr>
           <w:b/>
         </w:rPr>
-        <w:lastRenderedPageBreak/>
         <w:t>Análisis.</w:t>
       </w:r>
       <w:r>
@@ -45508,10 +45482,10 @@
           <w:noProof/>
         </w:rPr>
         <w:drawing>
-          <wp:inline distT="0" distB="0" distL="0" distR="0" wp14:anchorId="64338B7E" wp14:editId="44DD0490">
+          <wp:inline distT="0" distB="0" distL="0" distR="0" wp14:anchorId="68FE0D77" wp14:editId="2734DEA0">
             <wp:extent cx="5050370" cy="2934335"/>
             <wp:effectExtent l="0" t="0" r="0" b="0"/>
-            <wp:docPr id="975132728" name="Imagen 34"/>
+            <wp:docPr id="2001493830" name="Imagen 34"/>
             <wp:cNvGraphicFramePr>
               <a:graphicFrameLocks xmlns:a="http://schemas.openxmlformats.org/drawingml/2006/main" noChangeAspect="1"/>
             </wp:cNvGraphicFramePr>
@@ -45519,7 +45493,7 @@
               <a:graphicData uri="http://schemas.openxmlformats.org/drawingml/2006/picture">
                 <pic:pic xmlns:pic="http://schemas.openxmlformats.org/drawingml/2006/picture">
                   <pic:nvPicPr>
-                    <pic:cNvPr id="975132728" name=""/>
+                    <pic:cNvPr id="2001493830" name=""/>
                     <pic:cNvPicPr/>
                   </pic:nvPicPr>
                   <pic:blipFill>
@@ -45590,10 +45564,10 @@
           <w:noProof/>
         </w:rPr>
         <w:drawing>
-          <wp:inline distT="0" distB="0" distL="0" distR="0" wp14:anchorId="670084F9" wp14:editId="6C744DE4">
+          <wp:inline distT="0" distB="0" distL="0" distR="0" wp14:anchorId="4A076500" wp14:editId="7D75B1D9">
             <wp:extent cx="5050370" cy="2934335"/>
             <wp:effectExtent l="0" t="0" r="0" b="0"/>
-            <wp:docPr id="832206986" name="Imagen 35"/>
+            <wp:docPr id="1816280042" name="Imagen 35"/>
             <wp:cNvGraphicFramePr>
               <a:graphicFrameLocks xmlns:a="http://schemas.openxmlformats.org/drawingml/2006/main" noChangeAspect="1"/>
             </wp:cNvGraphicFramePr>
@@ -45601,7 +45575,7 @@
               <a:graphicData uri="http://schemas.openxmlformats.org/drawingml/2006/picture">
                 <pic:pic xmlns:pic="http://schemas.openxmlformats.org/drawingml/2006/picture">
                   <pic:nvPicPr>
-                    <pic:cNvPr id="832206986" name=""/>
+                    <pic:cNvPr id="1816280042" name=""/>
                     <pic:cNvPicPr/>
                   </pic:nvPicPr>
                   <pic:blipFill>
@@ -45667,9 +45641,8 @@
         <w:spacing w:before="160" w:after="120"/>
         <w:jc w:val="left"/>
       </w:pPr>
-      <w:bookmarkStart w:id="46" w:name="_Toc242295041"/>
-      <w:r>
-        <w:lastRenderedPageBreak/>
+      <w:bookmarkStart w:id="46" w:name="_Toc242295516"/>
+      <w:r>
         <w:t>Modelo dinámico</w:t>
       </w:r>
       <w:bookmarkEnd w:id="46"/>
@@ -45741,10 +45714,10 @@
           <w:noProof/>
         </w:rPr>
         <w:drawing>
-          <wp:inline distT="0" distB="0" distL="0" distR="0" wp14:anchorId="5D4454E9" wp14:editId="52D4687C">
+          <wp:inline distT="0" distB="0" distL="0" distR="0" wp14:anchorId="68AFA642" wp14:editId="685836A4">
             <wp:extent cx="4770244" cy="2273935"/>
             <wp:effectExtent l="0" t="0" r="0" b="0"/>
-            <wp:docPr id="1614558197" name="Imagen 36"/>
+            <wp:docPr id="488452551" name="Imagen 36"/>
             <wp:cNvGraphicFramePr>
               <a:graphicFrameLocks xmlns:a="http://schemas.openxmlformats.org/drawingml/2006/main" noChangeAspect="1"/>
             </wp:cNvGraphicFramePr>
@@ -45752,7 +45725,7 @@
               <a:graphicData uri="http://schemas.openxmlformats.org/drawingml/2006/picture">
                 <pic:pic xmlns:pic="http://schemas.openxmlformats.org/drawingml/2006/picture">
                   <pic:nvPicPr>
-                    <pic:cNvPr id="1614558197" name=""/>
+                    <pic:cNvPr id="488452551" name=""/>
                     <pic:cNvPicPr/>
                   </pic:nvPicPr>
                   <pic:blipFill>
@@ -45851,7 +45824,7 @@
         <w:spacing w:before="240" w:after="120"/>
         <w:jc w:val="left"/>
       </w:pPr>
-      <w:bookmarkStart w:id="47" w:name="_Toc242295042"/>
+      <w:bookmarkStart w:id="47" w:name="_Toc242295517"/>
       <w:r>
         <w:t>Conclusiones</w:t>
       </w:r>
@@ -46436,27 +46409,6 @@
       <w:pPr>
         <w:spacing w:after="120"/>
       </w:pPr>
-    </w:p>
-    <w:p>
-      <w:pPr>
-        <w:pStyle w:val="Ttulo1"/>
-        <w:pageBreakBefore/>
-        <w:spacing w:before="240" w:after="120"/>
-        <w:jc w:val="left"/>
-      </w:pPr>
-      <w:bookmarkStart w:id="48" w:name="_Toc242295043"/>
-      <w:r>
-        <w:t>Datos faltantes del plano</w:t>
-      </w:r>
-      <w:bookmarkEnd w:id="48"/>
-    </w:p>
-    <w:p>
-      <w:pPr>
-        <w:spacing w:after="120"/>
-      </w:pPr>
-      <w:r>
-        <w:t>Los siguientes parámetros no están en el plano V2.4 y se trataron como variables: curva par–velocidad y par máximo del servo y del N20, reducción interna del N20, fricción entre dientes de los sinfines, ángulo de presión de los engranes, mano de los sinfines B y C, eficiencia del par z20, espesor y masa de la palma, diámetro del objeto, rigidez torsional de los trenes e inercia y amortiguamiento equivalentes de los motores.</w:t>
-      </w:r>
     </w:p>
     <w:sectPr>
       <w:footerReference w:type="default" r:id="rId49"/>
@@ -46648,7 +46600,7 @@
 <file path=word/numbering.xml><?xml version="1.0" encoding="utf-8"?>
 <w:numbering xmlns:wpc="http://schemas.microsoft.com/office/word/2010/wordprocessingCanvas" xmlns:cx="http://schemas.microsoft.com/office/drawing/2014/chartex" xmlns:cx1="http://schemas.microsoft.com/office/drawing/2015/9/8/chartex" xmlns:cx2="http://schemas.microsoft.com/office/drawing/2015/10/21/chartex" xmlns:cx3="http://schemas.microsoft.com/office/drawing/2016/5/9/chartex" xmlns:cx4="http://schemas.microsoft.com/office/drawing/2016/5/10/chartex" xmlns:cx5="http://schemas.microsoft.com/office/drawing/2016/5/11/chartex" xmlns:cx6="http://schemas.microsoft.com/office/drawing/2016/5/12/chartex" xmlns:cx7="http://schemas.microsoft.com/office/drawing/2016/5/13/chartex" xmlns:cx8="http://schemas.microsoft.com/office/drawing/2016/5/14/chartex" xmlns:mc="http://schemas.openxmlformats.org/markup-compatibility/2006" xmlns:aink="http://schemas.microsoft.com/office/drawing/2016/ink" xmlns:am3d="http://schemas.microsoft.com/office/drawing/2017/model3d" xmlns:o="urn:schemas-microsoft-com:office:office" xmlns:oel="http://schemas.microsoft.com/office/2019/extlst" xmlns:r="http://schemas.openxmlformats.org/officeDocument/2006/relationships" xmlns:m="http://schemas.openxmlformats.org/officeDocument/2006/math" xmlns:v="urn:schemas-microsoft-com:vml" xmlns:wp14="http://schemas.microsoft.com/office/word/2010/wordprocessingDrawing" xmlns:wp="http://schemas.openxmlformats.org/drawingml/2006/wordprocessingDrawing" xmlns:w10="urn:schemas-microsoft-com:office:word" xmlns:w="http://schemas.openxmlformats.org/wordprocessingml/2006/main" xmlns:w14="http://schemas.microsoft.com/office/word/2010/wordml" xmlns:w15="http://schemas.microsoft.com/office/word/2012/wordml" xmlns:w16cex="http://schemas.microsoft.com/office/word/2018/wordml/cex" xmlns:w16cid="http://schemas.microsoft.com/office/word/2016/wordml/cid" xmlns:w16="http://schemas.microsoft.com/office/word/2018/wordml" xmlns:w16du="http://schemas.microsoft.com/office/word/2023/wordml/word16du" xmlns:w16sdtdh="http://schemas.microsoft.com/office/word/2020/wordml/sdtdatahash" xmlns:w16sdtfl="http://schemas.microsoft.com/office/word/2024/wordml/sdtformatlock" xmlns:w16se="http://schemas.microsoft.com/office/word/2015/wordml/symex" xmlns:wpg="http://schemas.microsoft.com/office/word/2010/wordprocessingGroup" xmlns:wpi="http://schemas.microsoft.com/office/word/2010/wordprocessingInk" xmlns:wne="http://schemas.microsoft.com/office/word/2006/wordml" xmlns:wps="http://schemas.microsoft.com/office/word/2010/wordprocessingShape" mc:Ignorable="w14 w15 w16se w16cid w16 w16cex w16sdtdh w16sdtfl w16du wp14">
   <w:abstractNum w:abstractNumId="0" w15:restartNumberingAfterBreak="0">
-    <w:nsid w:val="01071D88"/>
+    <w:nsid w:val="08415572"/>
     <w:multiLevelType w:val="singleLevel"/>
     <w:tmpl w:val="04090001"/>
     <w:lvl w:ilvl="0">
@@ -46665,7 +46617,7 @@
     </w:lvl>
   </w:abstractNum>
   <w:abstractNum w:abstractNumId="1" w15:restartNumberingAfterBreak="0">
-    <w:nsid w:val="028F59F8"/>
+    <w:nsid w:val="0FFA2430"/>
     <w:multiLevelType w:val="singleLevel"/>
     <w:tmpl w:val="04090001"/>
     <w:lvl w:ilvl="0">
@@ -46682,7 +46634,7 @@
     </w:lvl>
   </w:abstractNum>
   <w:abstractNum w:abstractNumId="2" w15:restartNumberingAfterBreak="0">
-    <w:nsid w:val="03CA797F"/>
+    <w:nsid w:val="16283933"/>
     <w:multiLevelType w:val="singleLevel"/>
     <w:tmpl w:val="04090001"/>
     <w:lvl w:ilvl="0">
@@ -46699,7 +46651,7 @@
     </w:lvl>
   </w:abstractNum>
   <w:abstractNum w:abstractNumId="3" w15:restartNumberingAfterBreak="0">
-    <w:nsid w:val="06220968"/>
+    <w:nsid w:val="17A66001"/>
     <w:multiLevelType w:val="singleLevel"/>
     <w:tmpl w:val="04090001"/>
     <w:lvl w:ilvl="0">
@@ -46716,7 +46668,7 @@
     </w:lvl>
   </w:abstractNum>
   <w:abstractNum w:abstractNumId="4" w15:restartNumberingAfterBreak="0">
-    <w:nsid w:val="096173A6"/>
+    <w:nsid w:val="18577C8D"/>
     <w:multiLevelType w:val="singleLevel"/>
     <w:tmpl w:val="04090001"/>
     <w:lvl w:ilvl="0">
@@ -46733,7 +46685,7 @@
     </w:lvl>
   </w:abstractNum>
   <w:abstractNum w:abstractNumId="5" w15:restartNumberingAfterBreak="0">
-    <w:nsid w:val="0AC42D37"/>
+    <w:nsid w:val="1BD57F4F"/>
     <w:multiLevelType w:val="singleLevel"/>
     <w:tmpl w:val="04090001"/>
     <w:lvl w:ilvl="0">
@@ -46750,7 +46702,7 @@
     </w:lvl>
   </w:abstractNum>
   <w:abstractNum w:abstractNumId="6" w15:restartNumberingAfterBreak="0">
-    <w:nsid w:val="0EC83C5D"/>
+    <w:nsid w:val="23483ABB"/>
     <w:multiLevelType w:val="singleLevel"/>
     <w:tmpl w:val="04090001"/>
     <w:lvl w:ilvl="0">
@@ -46767,7 +46719,7 @@
     </w:lvl>
   </w:abstractNum>
   <w:abstractNum w:abstractNumId="7" w15:restartNumberingAfterBreak="0">
-    <w:nsid w:val="15662A99"/>
+    <w:nsid w:val="245A45C8"/>
     <w:multiLevelType w:val="singleLevel"/>
     <w:tmpl w:val="04090001"/>
     <w:lvl w:ilvl="0">
@@ -46784,7 +46736,7 @@
     </w:lvl>
   </w:abstractNum>
   <w:abstractNum w:abstractNumId="8" w15:restartNumberingAfterBreak="0">
-    <w:nsid w:val="15C266B4"/>
+    <w:nsid w:val="24F7436A"/>
     <w:multiLevelType w:val="singleLevel"/>
     <w:tmpl w:val="04090001"/>
     <w:lvl w:ilvl="0">
@@ -46801,7 +46753,7 @@
     </w:lvl>
   </w:abstractNum>
   <w:abstractNum w:abstractNumId="9" w15:restartNumberingAfterBreak="0">
-    <w:nsid w:val="16E160B1"/>
+    <w:nsid w:val="280165D4"/>
     <w:multiLevelType w:val="singleLevel"/>
     <w:tmpl w:val="04090001"/>
     <w:lvl w:ilvl="0">
@@ -46818,7 +46770,7 @@
     </w:lvl>
   </w:abstractNum>
   <w:abstractNum w:abstractNumId="10" w15:restartNumberingAfterBreak="0">
-    <w:nsid w:val="1C6C22F1"/>
+    <w:nsid w:val="292108D4"/>
     <w:multiLevelType w:val="singleLevel"/>
     <w:tmpl w:val="04090001"/>
     <w:lvl w:ilvl="0">
@@ -46835,7 +46787,7 @@
     </w:lvl>
   </w:abstractNum>
   <w:abstractNum w:abstractNumId="11" w15:restartNumberingAfterBreak="0">
-    <w:nsid w:val="1D810D83"/>
+    <w:nsid w:val="2FC73219"/>
     <w:multiLevelType w:val="singleLevel"/>
     <w:tmpl w:val="04090001"/>
     <w:lvl w:ilvl="0">
@@ -46852,7 +46804,7 @@
     </w:lvl>
   </w:abstractNum>
   <w:abstractNum w:abstractNumId="12" w15:restartNumberingAfterBreak="0">
-    <w:nsid w:val="1FF47926"/>
+    <w:nsid w:val="305B5222"/>
     <w:multiLevelType w:val="singleLevel"/>
     <w:tmpl w:val="04090001"/>
     <w:lvl w:ilvl="0">
@@ -46869,7 +46821,7 @@
     </w:lvl>
   </w:abstractNum>
   <w:abstractNum w:abstractNumId="13" w15:restartNumberingAfterBreak="0">
-    <w:nsid w:val="205A461F"/>
+    <w:nsid w:val="327C0D0C"/>
     <w:multiLevelType w:val="singleLevel"/>
     <w:tmpl w:val="04090001"/>
     <w:lvl w:ilvl="0">
@@ -46886,7 +46838,7 @@
     </w:lvl>
   </w:abstractNum>
   <w:abstractNum w:abstractNumId="14" w15:restartNumberingAfterBreak="0">
-    <w:nsid w:val="27A06C6C"/>
+    <w:nsid w:val="331F75D7"/>
     <w:multiLevelType w:val="singleLevel"/>
     <w:tmpl w:val="04090001"/>
     <w:lvl w:ilvl="0">
@@ -46903,366 +46855,9 @@
     </w:lvl>
   </w:abstractNum>
   <w:abstractNum w:abstractNumId="15" w15:restartNumberingAfterBreak="0">
-    <w:nsid w:val="27B80823"/>
-    <w:multiLevelType w:val="singleLevel"/>
-    <w:tmpl w:val="04090001"/>
-    <w:lvl w:ilvl="0">
-      <w:start w:val="1"/>
-      <w:numFmt w:val="bullet"/>
-      <w:lvlText w:val=""/>
-      <w:lvlJc w:val="left"/>
-      <w:pPr>
-        <w:ind w:left="720" w:hanging="360"/>
-      </w:pPr>
-      <w:rPr>
-        <w:rFonts w:ascii="Symbol" w:hAnsi="Symbol" w:hint="default"/>
-      </w:rPr>
-    </w:lvl>
-  </w:abstractNum>
-  <w:abstractNum w:abstractNumId="16" w15:restartNumberingAfterBreak="0">
-    <w:nsid w:val="2AB4050F"/>
-    <w:multiLevelType w:val="singleLevel"/>
-    <w:tmpl w:val="04090001"/>
-    <w:lvl w:ilvl="0">
-      <w:start w:val="1"/>
-      <w:numFmt w:val="bullet"/>
-      <w:lvlText w:val=""/>
-      <w:lvlJc w:val="left"/>
-      <w:pPr>
-        <w:ind w:left="720" w:hanging="360"/>
-      </w:pPr>
-      <w:rPr>
-        <w:rFonts w:ascii="Symbol" w:hAnsi="Symbol" w:hint="default"/>
-      </w:rPr>
-    </w:lvl>
-  </w:abstractNum>
-  <w:abstractNum w:abstractNumId="17" w15:restartNumberingAfterBreak="0">
-    <w:nsid w:val="2D5979C5"/>
-    <w:multiLevelType w:val="singleLevel"/>
-    <w:tmpl w:val="04090001"/>
-    <w:lvl w:ilvl="0">
-      <w:start w:val="1"/>
-      <w:numFmt w:val="bullet"/>
-      <w:lvlText w:val=""/>
-      <w:lvlJc w:val="left"/>
-      <w:pPr>
-        <w:ind w:left="720" w:hanging="360"/>
-      </w:pPr>
-      <w:rPr>
-        <w:rFonts w:ascii="Symbol" w:hAnsi="Symbol" w:hint="default"/>
-      </w:rPr>
-    </w:lvl>
-  </w:abstractNum>
-  <w:abstractNum w:abstractNumId="18" w15:restartNumberingAfterBreak="0">
-    <w:nsid w:val="2F192068"/>
-    <w:multiLevelType w:val="singleLevel"/>
-    <w:tmpl w:val="04090001"/>
-    <w:lvl w:ilvl="0">
-      <w:start w:val="1"/>
-      <w:numFmt w:val="bullet"/>
-      <w:lvlText w:val=""/>
-      <w:lvlJc w:val="left"/>
-      <w:pPr>
-        <w:ind w:left="720" w:hanging="360"/>
-      </w:pPr>
-      <w:rPr>
-        <w:rFonts w:ascii="Symbol" w:hAnsi="Symbol" w:hint="default"/>
-      </w:rPr>
-    </w:lvl>
-  </w:abstractNum>
-  <w:abstractNum w:abstractNumId="19" w15:restartNumberingAfterBreak="0">
-    <w:nsid w:val="2F382D75"/>
-    <w:multiLevelType w:val="singleLevel"/>
-    <w:tmpl w:val="04090001"/>
-    <w:lvl w:ilvl="0">
-      <w:start w:val="1"/>
-      <w:numFmt w:val="bullet"/>
-      <w:lvlText w:val=""/>
-      <w:lvlJc w:val="left"/>
-      <w:pPr>
-        <w:ind w:left="720" w:hanging="360"/>
-      </w:pPr>
-      <w:rPr>
-        <w:rFonts w:ascii="Symbol" w:hAnsi="Symbol" w:hint="default"/>
-      </w:rPr>
-    </w:lvl>
-  </w:abstractNum>
-  <w:abstractNum w:abstractNumId="20" w15:restartNumberingAfterBreak="0">
-    <w:nsid w:val="34CF2B78"/>
-    <w:multiLevelType w:val="singleLevel"/>
-    <w:tmpl w:val="04090001"/>
-    <w:lvl w:ilvl="0">
-      <w:start w:val="1"/>
-      <w:numFmt w:val="bullet"/>
-      <w:lvlText w:val=""/>
-      <w:lvlJc w:val="left"/>
-      <w:pPr>
-        <w:ind w:left="720" w:hanging="360"/>
-      </w:pPr>
-      <w:rPr>
-        <w:rFonts w:ascii="Symbol" w:hAnsi="Symbol" w:hint="default"/>
-      </w:rPr>
-    </w:lvl>
-  </w:abstractNum>
-  <w:abstractNum w:abstractNumId="21" w15:restartNumberingAfterBreak="0">
-    <w:nsid w:val="38C7660A"/>
-    <w:multiLevelType w:val="singleLevel"/>
-    <w:tmpl w:val="04090001"/>
-    <w:lvl w:ilvl="0">
-      <w:start w:val="1"/>
-      <w:numFmt w:val="bullet"/>
-      <w:lvlText w:val=""/>
-      <w:lvlJc w:val="left"/>
-      <w:pPr>
-        <w:ind w:left="720" w:hanging="360"/>
-      </w:pPr>
-      <w:rPr>
-        <w:rFonts w:ascii="Symbol" w:hAnsi="Symbol" w:hint="default"/>
-      </w:rPr>
-    </w:lvl>
-  </w:abstractNum>
-  <w:abstractNum w:abstractNumId="22" w15:restartNumberingAfterBreak="0">
-    <w:nsid w:val="3A0F041C"/>
-    <w:multiLevelType w:val="singleLevel"/>
-    <w:tmpl w:val="04090001"/>
-    <w:lvl w:ilvl="0">
-      <w:start w:val="1"/>
-      <w:numFmt w:val="bullet"/>
-      <w:lvlText w:val=""/>
-      <w:lvlJc w:val="left"/>
-      <w:pPr>
-        <w:ind w:left="720" w:hanging="360"/>
-      </w:pPr>
-      <w:rPr>
-        <w:rFonts w:ascii="Symbol" w:hAnsi="Symbol" w:hint="default"/>
-      </w:rPr>
-    </w:lvl>
-  </w:abstractNum>
-  <w:abstractNum w:abstractNumId="23" w15:restartNumberingAfterBreak="0">
-    <w:nsid w:val="3A2C74D7"/>
-    <w:multiLevelType w:val="singleLevel"/>
-    <w:tmpl w:val="04090001"/>
-    <w:lvl w:ilvl="0">
-      <w:start w:val="1"/>
-      <w:numFmt w:val="bullet"/>
-      <w:lvlText w:val=""/>
-      <w:lvlJc w:val="left"/>
-      <w:pPr>
-        <w:ind w:left="720" w:hanging="360"/>
-      </w:pPr>
-      <w:rPr>
-        <w:rFonts w:ascii="Symbol" w:hAnsi="Symbol" w:hint="default"/>
-      </w:rPr>
-    </w:lvl>
-  </w:abstractNum>
-  <w:abstractNum w:abstractNumId="24" w15:restartNumberingAfterBreak="0">
-    <w:nsid w:val="3D0A7798"/>
-    <w:multiLevelType w:val="singleLevel"/>
-    <w:tmpl w:val="04090001"/>
-    <w:lvl w:ilvl="0">
-      <w:start w:val="1"/>
-      <w:numFmt w:val="bullet"/>
-      <w:lvlText w:val=""/>
-      <w:lvlJc w:val="left"/>
-      <w:pPr>
-        <w:ind w:left="720" w:hanging="360"/>
-      </w:pPr>
-      <w:rPr>
-        <w:rFonts w:ascii="Symbol" w:hAnsi="Symbol" w:hint="default"/>
-      </w:rPr>
-    </w:lvl>
-  </w:abstractNum>
-  <w:abstractNum w:abstractNumId="25" w15:restartNumberingAfterBreak="0">
-    <w:nsid w:val="41F765A8"/>
-    <w:multiLevelType w:val="singleLevel"/>
-    <w:tmpl w:val="04090001"/>
-    <w:lvl w:ilvl="0">
-      <w:start w:val="1"/>
-      <w:numFmt w:val="bullet"/>
-      <w:lvlText w:val=""/>
-      <w:lvlJc w:val="left"/>
-      <w:pPr>
-        <w:ind w:left="720" w:hanging="360"/>
-      </w:pPr>
-      <w:rPr>
-        <w:rFonts w:ascii="Symbol" w:hAnsi="Symbol" w:hint="default"/>
-      </w:rPr>
-    </w:lvl>
-  </w:abstractNum>
-  <w:abstractNum w:abstractNumId="26" w15:restartNumberingAfterBreak="0">
-    <w:nsid w:val="47710F2D"/>
-    <w:multiLevelType w:val="singleLevel"/>
-    <w:tmpl w:val="04090001"/>
-    <w:lvl w:ilvl="0">
-      <w:start w:val="1"/>
-      <w:numFmt w:val="bullet"/>
-      <w:lvlText w:val=""/>
-      <w:lvlJc w:val="left"/>
-      <w:pPr>
-        <w:ind w:left="720" w:hanging="360"/>
-      </w:pPr>
-      <w:rPr>
-        <w:rFonts w:ascii="Symbol" w:hAnsi="Symbol" w:hint="default"/>
-      </w:rPr>
-    </w:lvl>
-  </w:abstractNum>
-  <w:abstractNum w:abstractNumId="27" w15:restartNumberingAfterBreak="0">
-    <w:nsid w:val="48FD4CC9"/>
-    <w:multiLevelType w:val="singleLevel"/>
-    <w:tmpl w:val="04090001"/>
-    <w:lvl w:ilvl="0">
-      <w:start w:val="1"/>
-      <w:numFmt w:val="bullet"/>
-      <w:lvlText w:val=""/>
-      <w:lvlJc w:val="left"/>
-      <w:pPr>
-        <w:ind w:left="720" w:hanging="360"/>
-      </w:pPr>
-      <w:rPr>
-        <w:rFonts w:ascii="Symbol" w:hAnsi="Symbol" w:hint="default"/>
-      </w:rPr>
-    </w:lvl>
-  </w:abstractNum>
-  <w:abstractNum w:abstractNumId="28" w15:restartNumberingAfterBreak="0">
-    <w:nsid w:val="4B0261F5"/>
-    <w:multiLevelType w:val="singleLevel"/>
-    <w:tmpl w:val="04090001"/>
-    <w:lvl w:ilvl="0">
-      <w:start w:val="1"/>
-      <w:numFmt w:val="bullet"/>
-      <w:lvlText w:val=""/>
-      <w:lvlJc w:val="left"/>
-      <w:pPr>
-        <w:ind w:left="720" w:hanging="360"/>
-      </w:pPr>
-      <w:rPr>
-        <w:rFonts w:ascii="Symbol" w:hAnsi="Symbol" w:hint="default"/>
-      </w:rPr>
-    </w:lvl>
-  </w:abstractNum>
-  <w:abstractNum w:abstractNumId="29" w15:restartNumberingAfterBreak="0">
-    <w:nsid w:val="4BF82374"/>
-    <w:multiLevelType w:val="singleLevel"/>
-    <w:tmpl w:val="04090001"/>
-    <w:lvl w:ilvl="0">
-      <w:start w:val="1"/>
-      <w:numFmt w:val="bullet"/>
-      <w:lvlText w:val=""/>
-      <w:lvlJc w:val="left"/>
-      <w:pPr>
-        <w:ind w:left="720" w:hanging="360"/>
-      </w:pPr>
-      <w:rPr>
-        <w:rFonts w:ascii="Symbol" w:hAnsi="Symbol" w:hint="default"/>
-      </w:rPr>
-    </w:lvl>
-  </w:abstractNum>
-  <w:abstractNum w:abstractNumId="30" w15:restartNumberingAfterBreak="0">
-    <w:nsid w:val="4C8B4843"/>
-    <w:multiLevelType w:val="singleLevel"/>
-    <w:tmpl w:val="04090001"/>
-    <w:lvl w:ilvl="0">
-      <w:start w:val="1"/>
-      <w:numFmt w:val="bullet"/>
-      <w:lvlText w:val=""/>
-      <w:lvlJc w:val="left"/>
-      <w:pPr>
-        <w:ind w:left="720" w:hanging="360"/>
-      </w:pPr>
-      <w:rPr>
-        <w:rFonts w:ascii="Symbol" w:hAnsi="Symbol" w:hint="default"/>
-      </w:rPr>
-    </w:lvl>
-  </w:abstractNum>
-  <w:abstractNum w:abstractNumId="31" w15:restartNumberingAfterBreak="0">
-    <w:nsid w:val="4C947C86"/>
-    <w:multiLevelType w:val="singleLevel"/>
-    <w:tmpl w:val="04090001"/>
-    <w:lvl w:ilvl="0">
-      <w:start w:val="1"/>
-      <w:numFmt w:val="bullet"/>
-      <w:lvlText w:val=""/>
-      <w:lvlJc w:val="left"/>
-      <w:pPr>
-        <w:ind w:left="720" w:hanging="360"/>
-      </w:pPr>
-      <w:rPr>
-        <w:rFonts w:ascii="Symbol" w:hAnsi="Symbol" w:hint="default"/>
-      </w:rPr>
-    </w:lvl>
-  </w:abstractNum>
-  <w:abstractNum w:abstractNumId="32" w15:restartNumberingAfterBreak="0">
-    <w:nsid w:val="4F8727B9"/>
-    <w:multiLevelType w:val="singleLevel"/>
-    <w:tmpl w:val="04090001"/>
-    <w:lvl w:ilvl="0">
-      <w:start w:val="1"/>
-      <w:numFmt w:val="bullet"/>
-      <w:lvlText w:val=""/>
-      <w:lvlJc w:val="left"/>
-      <w:pPr>
-        <w:ind w:left="720" w:hanging="360"/>
-      </w:pPr>
-      <w:rPr>
-        <w:rFonts w:ascii="Symbol" w:hAnsi="Symbol" w:hint="default"/>
-      </w:rPr>
-    </w:lvl>
-  </w:abstractNum>
-  <w:abstractNum w:abstractNumId="33" w15:restartNumberingAfterBreak="0">
-    <w:nsid w:val="4FBF286C"/>
-    <w:multiLevelType w:val="singleLevel"/>
-    <w:tmpl w:val="04090001"/>
-    <w:lvl w:ilvl="0">
-      <w:start w:val="1"/>
-      <w:numFmt w:val="bullet"/>
-      <w:lvlText w:val=""/>
-      <w:lvlJc w:val="left"/>
-      <w:pPr>
-        <w:ind w:left="720" w:hanging="360"/>
-      </w:pPr>
-      <w:rPr>
-        <w:rFonts w:ascii="Symbol" w:hAnsi="Symbol" w:hint="default"/>
-      </w:rPr>
-    </w:lvl>
-  </w:abstractNum>
-  <w:abstractNum w:abstractNumId="34" w15:restartNumberingAfterBreak="0">
-    <w:nsid w:val="51DF17C4"/>
-    <w:multiLevelType w:val="singleLevel"/>
-    <w:tmpl w:val="04090001"/>
-    <w:lvl w:ilvl="0">
-      <w:start w:val="1"/>
-      <w:numFmt w:val="bullet"/>
-      <w:lvlText w:val=""/>
-      <w:lvlJc w:val="left"/>
-      <w:pPr>
-        <w:ind w:left="720" w:hanging="360"/>
-      </w:pPr>
-      <w:rPr>
-        <w:rFonts w:ascii="Symbol" w:hAnsi="Symbol" w:hint="default"/>
-      </w:rPr>
-    </w:lvl>
-  </w:abstractNum>
-  <w:abstractNum w:abstractNumId="35" w15:restartNumberingAfterBreak="0">
-    <w:nsid w:val="52BC3A03"/>
-    <w:multiLevelType w:val="singleLevel"/>
-    <w:tmpl w:val="04090001"/>
-    <w:lvl w:ilvl="0">
-      <w:start w:val="1"/>
-      <w:numFmt w:val="bullet"/>
-      <w:lvlText w:val=""/>
-      <w:lvlJc w:val="left"/>
-      <w:pPr>
-        <w:ind w:left="720" w:hanging="360"/>
-      </w:pPr>
-      <w:rPr>
-        <w:rFonts w:ascii="Symbol" w:hAnsi="Symbol" w:hint="default"/>
-      </w:rPr>
-    </w:lvl>
-  </w:abstractNum>
-  <w:abstractNum w:abstractNumId="36" w15:restartNumberingAfterBreak="0">
-    <w:nsid w:val="53FF313C"/>
+    <w:nsid w:val="36EE7B67"/>
     <w:multiLevelType w:val="multilevel"/>
-    <w:tmpl w:val="EDF43666"/>
+    <w:tmpl w:val="91F858FA"/>
     <w:lvl w:ilvl="0">
       <w:start w:val="1"/>
       <w:numFmt w:val="decimal"/>
@@ -47375,8 +46970,365 @@
       </w:rPr>
     </w:lvl>
   </w:abstractNum>
+  <w:abstractNum w:abstractNumId="16" w15:restartNumberingAfterBreak="0">
+    <w:nsid w:val="37F15663"/>
+    <w:multiLevelType w:val="singleLevel"/>
+    <w:tmpl w:val="04090001"/>
+    <w:lvl w:ilvl="0">
+      <w:start w:val="1"/>
+      <w:numFmt w:val="bullet"/>
+      <w:lvlText w:val=""/>
+      <w:lvlJc w:val="left"/>
+      <w:pPr>
+        <w:ind w:left="720" w:hanging="360"/>
+      </w:pPr>
+      <w:rPr>
+        <w:rFonts w:ascii="Symbol" w:hAnsi="Symbol" w:hint="default"/>
+      </w:rPr>
+    </w:lvl>
+  </w:abstractNum>
+  <w:abstractNum w:abstractNumId="17" w15:restartNumberingAfterBreak="0">
+    <w:nsid w:val="3B5434FB"/>
+    <w:multiLevelType w:val="singleLevel"/>
+    <w:tmpl w:val="04090001"/>
+    <w:lvl w:ilvl="0">
+      <w:start w:val="1"/>
+      <w:numFmt w:val="bullet"/>
+      <w:lvlText w:val=""/>
+      <w:lvlJc w:val="left"/>
+      <w:pPr>
+        <w:ind w:left="720" w:hanging="360"/>
+      </w:pPr>
+      <w:rPr>
+        <w:rFonts w:ascii="Symbol" w:hAnsi="Symbol" w:hint="default"/>
+      </w:rPr>
+    </w:lvl>
+  </w:abstractNum>
+  <w:abstractNum w:abstractNumId="18" w15:restartNumberingAfterBreak="0">
+    <w:nsid w:val="3D3C67A4"/>
+    <w:multiLevelType w:val="singleLevel"/>
+    <w:tmpl w:val="04090001"/>
+    <w:lvl w:ilvl="0">
+      <w:start w:val="1"/>
+      <w:numFmt w:val="bullet"/>
+      <w:lvlText w:val=""/>
+      <w:lvlJc w:val="left"/>
+      <w:pPr>
+        <w:ind w:left="720" w:hanging="360"/>
+      </w:pPr>
+      <w:rPr>
+        <w:rFonts w:ascii="Symbol" w:hAnsi="Symbol" w:hint="default"/>
+      </w:rPr>
+    </w:lvl>
+  </w:abstractNum>
+  <w:abstractNum w:abstractNumId="19" w15:restartNumberingAfterBreak="0">
+    <w:nsid w:val="3F9B4C04"/>
+    <w:multiLevelType w:val="singleLevel"/>
+    <w:tmpl w:val="04090001"/>
+    <w:lvl w:ilvl="0">
+      <w:start w:val="1"/>
+      <w:numFmt w:val="bullet"/>
+      <w:lvlText w:val=""/>
+      <w:lvlJc w:val="left"/>
+      <w:pPr>
+        <w:ind w:left="720" w:hanging="360"/>
+      </w:pPr>
+      <w:rPr>
+        <w:rFonts w:ascii="Symbol" w:hAnsi="Symbol" w:hint="default"/>
+      </w:rPr>
+    </w:lvl>
+  </w:abstractNum>
+  <w:abstractNum w:abstractNumId="20" w15:restartNumberingAfterBreak="0">
+    <w:nsid w:val="3FED2219"/>
+    <w:multiLevelType w:val="singleLevel"/>
+    <w:tmpl w:val="04090001"/>
+    <w:lvl w:ilvl="0">
+      <w:start w:val="1"/>
+      <w:numFmt w:val="bullet"/>
+      <w:lvlText w:val=""/>
+      <w:lvlJc w:val="left"/>
+      <w:pPr>
+        <w:ind w:left="720" w:hanging="360"/>
+      </w:pPr>
+      <w:rPr>
+        <w:rFonts w:ascii="Symbol" w:hAnsi="Symbol" w:hint="default"/>
+      </w:rPr>
+    </w:lvl>
+  </w:abstractNum>
+  <w:abstractNum w:abstractNumId="21" w15:restartNumberingAfterBreak="0">
+    <w:nsid w:val="46AF6FB6"/>
+    <w:multiLevelType w:val="singleLevel"/>
+    <w:tmpl w:val="04090001"/>
+    <w:lvl w:ilvl="0">
+      <w:start w:val="1"/>
+      <w:numFmt w:val="bullet"/>
+      <w:lvlText w:val=""/>
+      <w:lvlJc w:val="left"/>
+      <w:pPr>
+        <w:ind w:left="720" w:hanging="360"/>
+      </w:pPr>
+      <w:rPr>
+        <w:rFonts w:ascii="Symbol" w:hAnsi="Symbol" w:hint="default"/>
+      </w:rPr>
+    </w:lvl>
+  </w:abstractNum>
+  <w:abstractNum w:abstractNumId="22" w15:restartNumberingAfterBreak="0">
+    <w:nsid w:val="4D655FAE"/>
+    <w:multiLevelType w:val="singleLevel"/>
+    <w:tmpl w:val="04090001"/>
+    <w:lvl w:ilvl="0">
+      <w:start w:val="1"/>
+      <w:numFmt w:val="bullet"/>
+      <w:lvlText w:val=""/>
+      <w:lvlJc w:val="left"/>
+      <w:pPr>
+        <w:ind w:left="720" w:hanging="360"/>
+      </w:pPr>
+      <w:rPr>
+        <w:rFonts w:ascii="Symbol" w:hAnsi="Symbol" w:hint="default"/>
+      </w:rPr>
+    </w:lvl>
+  </w:abstractNum>
+  <w:abstractNum w:abstractNumId="23" w15:restartNumberingAfterBreak="0">
+    <w:nsid w:val="4DC95B88"/>
+    <w:multiLevelType w:val="singleLevel"/>
+    <w:tmpl w:val="04090001"/>
+    <w:lvl w:ilvl="0">
+      <w:start w:val="1"/>
+      <w:numFmt w:val="bullet"/>
+      <w:lvlText w:val=""/>
+      <w:lvlJc w:val="left"/>
+      <w:pPr>
+        <w:ind w:left="720" w:hanging="360"/>
+      </w:pPr>
+      <w:rPr>
+        <w:rFonts w:ascii="Symbol" w:hAnsi="Symbol" w:hint="default"/>
+      </w:rPr>
+    </w:lvl>
+  </w:abstractNum>
+  <w:abstractNum w:abstractNumId="24" w15:restartNumberingAfterBreak="0">
+    <w:nsid w:val="50DE1CB8"/>
+    <w:multiLevelType w:val="singleLevel"/>
+    <w:tmpl w:val="04090001"/>
+    <w:lvl w:ilvl="0">
+      <w:start w:val="1"/>
+      <w:numFmt w:val="bullet"/>
+      <w:lvlText w:val=""/>
+      <w:lvlJc w:val="left"/>
+      <w:pPr>
+        <w:ind w:left="720" w:hanging="360"/>
+      </w:pPr>
+      <w:rPr>
+        <w:rFonts w:ascii="Symbol" w:hAnsi="Symbol" w:hint="default"/>
+      </w:rPr>
+    </w:lvl>
+  </w:abstractNum>
+  <w:abstractNum w:abstractNumId="25" w15:restartNumberingAfterBreak="0">
+    <w:nsid w:val="50FF034B"/>
+    <w:multiLevelType w:val="singleLevel"/>
+    <w:tmpl w:val="04090001"/>
+    <w:lvl w:ilvl="0">
+      <w:start w:val="1"/>
+      <w:numFmt w:val="bullet"/>
+      <w:lvlText w:val=""/>
+      <w:lvlJc w:val="left"/>
+      <w:pPr>
+        <w:ind w:left="720" w:hanging="360"/>
+      </w:pPr>
+      <w:rPr>
+        <w:rFonts w:ascii="Symbol" w:hAnsi="Symbol" w:hint="default"/>
+      </w:rPr>
+    </w:lvl>
+  </w:abstractNum>
+  <w:abstractNum w:abstractNumId="26" w15:restartNumberingAfterBreak="0">
+    <w:nsid w:val="5148729C"/>
+    <w:multiLevelType w:val="singleLevel"/>
+    <w:tmpl w:val="04090001"/>
+    <w:lvl w:ilvl="0">
+      <w:start w:val="1"/>
+      <w:numFmt w:val="bullet"/>
+      <w:lvlText w:val=""/>
+      <w:lvlJc w:val="left"/>
+      <w:pPr>
+        <w:ind w:left="720" w:hanging="360"/>
+      </w:pPr>
+      <w:rPr>
+        <w:rFonts w:ascii="Symbol" w:hAnsi="Symbol" w:hint="default"/>
+      </w:rPr>
+    </w:lvl>
+  </w:abstractNum>
+  <w:abstractNum w:abstractNumId="27" w15:restartNumberingAfterBreak="0">
+    <w:nsid w:val="51F02DBC"/>
+    <w:multiLevelType w:val="singleLevel"/>
+    <w:tmpl w:val="04090001"/>
+    <w:lvl w:ilvl="0">
+      <w:start w:val="1"/>
+      <w:numFmt w:val="bullet"/>
+      <w:lvlText w:val=""/>
+      <w:lvlJc w:val="left"/>
+      <w:pPr>
+        <w:ind w:left="720" w:hanging="360"/>
+      </w:pPr>
+      <w:rPr>
+        <w:rFonts w:ascii="Symbol" w:hAnsi="Symbol" w:hint="default"/>
+      </w:rPr>
+    </w:lvl>
+  </w:abstractNum>
+  <w:abstractNum w:abstractNumId="28" w15:restartNumberingAfterBreak="0">
+    <w:nsid w:val="538306C6"/>
+    <w:multiLevelType w:val="singleLevel"/>
+    <w:tmpl w:val="04090001"/>
+    <w:lvl w:ilvl="0">
+      <w:start w:val="1"/>
+      <w:numFmt w:val="bullet"/>
+      <w:lvlText w:val=""/>
+      <w:lvlJc w:val="left"/>
+      <w:pPr>
+        <w:ind w:left="720" w:hanging="360"/>
+      </w:pPr>
+      <w:rPr>
+        <w:rFonts w:ascii="Symbol" w:hAnsi="Symbol" w:hint="default"/>
+      </w:rPr>
+    </w:lvl>
+  </w:abstractNum>
+  <w:abstractNum w:abstractNumId="29" w15:restartNumberingAfterBreak="0">
+    <w:nsid w:val="572566B1"/>
+    <w:multiLevelType w:val="singleLevel"/>
+    <w:tmpl w:val="04090001"/>
+    <w:lvl w:ilvl="0">
+      <w:start w:val="1"/>
+      <w:numFmt w:val="bullet"/>
+      <w:lvlText w:val=""/>
+      <w:lvlJc w:val="left"/>
+      <w:pPr>
+        <w:ind w:left="720" w:hanging="360"/>
+      </w:pPr>
+      <w:rPr>
+        <w:rFonts w:ascii="Symbol" w:hAnsi="Symbol" w:hint="default"/>
+      </w:rPr>
+    </w:lvl>
+  </w:abstractNum>
+  <w:abstractNum w:abstractNumId="30" w15:restartNumberingAfterBreak="0">
+    <w:nsid w:val="580C1C3E"/>
+    <w:multiLevelType w:val="singleLevel"/>
+    <w:tmpl w:val="04090001"/>
+    <w:lvl w:ilvl="0">
+      <w:start w:val="1"/>
+      <w:numFmt w:val="bullet"/>
+      <w:lvlText w:val=""/>
+      <w:lvlJc w:val="left"/>
+      <w:pPr>
+        <w:ind w:left="720" w:hanging="360"/>
+      </w:pPr>
+      <w:rPr>
+        <w:rFonts w:ascii="Symbol" w:hAnsi="Symbol" w:hint="default"/>
+      </w:rPr>
+    </w:lvl>
+  </w:abstractNum>
+  <w:abstractNum w:abstractNumId="31" w15:restartNumberingAfterBreak="0">
+    <w:nsid w:val="582E30ED"/>
+    <w:multiLevelType w:val="singleLevel"/>
+    <w:tmpl w:val="04090001"/>
+    <w:lvl w:ilvl="0">
+      <w:start w:val="1"/>
+      <w:numFmt w:val="bullet"/>
+      <w:lvlText w:val=""/>
+      <w:lvlJc w:val="left"/>
+      <w:pPr>
+        <w:ind w:left="720" w:hanging="360"/>
+      </w:pPr>
+      <w:rPr>
+        <w:rFonts w:ascii="Symbol" w:hAnsi="Symbol" w:hint="default"/>
+      </w:rPr>
+    </w:lvl>
+  </w:abstractNum>
+  <w:abstractNum w:abstractNumId="32" w15:restartNumberingAfterBreak="0">
+    <w:nsid w:val="5C4053CF"/>
+    <w:multiLevelType w:val="singleLevel"/>
+    <w:tmpl w:val="04090001"/>
+    <w:lvl w:ilvl="0">
+      <w:start w:val="1"/>
+      <w:numFmt w:val="bullet"/>
+      <w:lvlText w:val=""/>
+      <w:lvlJc w:val="left"/>
+      <w:pPr>
+        <w:ind w:left="720" w:hanging="360"/>
+      </w:pPr>
+      <w:rPr>
+        <w:rFonts w:ascii="Symbol" w:hAnsi="Symbol" w:hint="default"/>
+      </w:rPr>
+    </w:lvl>
+  </w:abstractNum>
+  <w:abstractNum w:abstractNumId="33" w15:restartNumberingAfterBreak="0">
+    <w:nsid w:val="645145C7"/>
+    <w:multiLevelType w:val="singleLevel"/>
+    <w:tmpl w:val="04090001"/>
+    <w:lvl w:ilvl="0">
+      <w:start w:val="1"/>
+      <w:numFmt w:val="bullet"/>
+      <w:lvlText w:val=""/>
+      <w:lvlJc w:val="left"/>
+      <w:pPr>
+        <w:ind w:left="720" w:hanging="360"/>
+      </w:pPr>
+      <w:rPr>
+        <w:rFonts w:ascii="Symbol" w:hAnsi="Symbol" w:hint="default"/>
+      </w:rPr>
+    </w:lvl>
+  </w:abstractNum>
+  <w:abstractNum w:abstractNumId="34" w15:restartNumberingAfterBreak="0">
+    <w:nsid w:val="6503606F"/>
+    <w:multiLevelType w:val="singleLevel"/>
+    <w:tmpl w:val="04090001"/>
+    <w:lvl w:ilvl="0">
+      <w:start w:val="1"/>
+      <w:numFmt w:val="bullet"/>
+      <w:lvlText w:val=""/>
+      <w:lvlJc w:val="left"/>
+      <w:pPr>
+        <w:ind w:left="720" w:hanging="360"/>
+      </w:pPr>
+      <w:rPr>
+        <w:rFonts w:ascii="Symbol" w:hAnsi="Symbol" w:hint="default"/>
+      </w:rPr>
+    </w:lvl>
+  </w:abstractNum>
+  <w:abstractNum w:abstractNumId="35" w15:restartNumberingAfterBreak="0">
+    <w:nsid w:val="6561754D"/>
+    <w:multiLevelType w:val="singleLevel"/>
+    <w:tmpl w:val="04090001"/>
+    <w:lvl w:ilvl="0">
+      <w:start w:val="1"/>
+      <w:numFmt w:val="bullet"/>
+      <w:lvlText w:val=""/>
+      <w:lvlJc w:val="left"/>
+      <w:pPr>
+        <w:ind w:left="720" w:hanging="360"/>
+      </w:pPr>
+      <w:rPr>
+        <w:rFonts w:ascii="Symbol" w:hAnsi="Symbol" w:hint="default"/>
+      </w:rPr>
+    </w:lvl>
+  </w:abstractNum>
+  <w:abstractNum w:abstractNumId="36" w15:restartNumberingAfterBreak="0">
+    <w:nsid w:val="66FC13BE"/>
+    <w:multiLevelType w:val="singleLevel"/>
+    <w:tmpl w:val="04090001"/>
+    <w:lvl w:ilvl="0">
+      <w:start w:val="1"/>
+      <w:numFmt w:val="bullet"/>
+      <w:lvlText w:val=""/>
+      <w:lvlJc w:val="left"/>
+      <w:pPr>
+        <w:ind w:left="720" w:hanging="360"/>
+      </w:pPr>
+      <w:rPr>
+        <w:rFonts w:ascii="Symbol" w:hAnsi="Symbol" w:hint="default"/>
+      </w:rPr>
+    </w:lvl>
+  </w:abstractNum>
   <w:abstractNum w:abstractNumId="37" w15:restartNumberingAfterBreak="0">
-    <w:nsid w:val="56EE40D9"/>
+    <w:nsid w:val="6A377E21"/>
     <w:multiLevelType w:val="singleLevel"/>
     <w:tmpl w:val="04090001"/>
     <w:lvl w:ilvl="0">
@@ -47393,7 +47345,7 @@
     </w:lvl>
   </w:abstractNum>
   <w:abstractNum w:abstractNumId="38" w15:restartNumberingAfterBreak="0">
-    <w:nsid w:val="5708249B"/>
+    <w:nsid w:val="6AD412CC"/>
     <w:multiLevelType w:val="singleLevel"/>
     <w:tmpl w:val="04090001"/>
     <w:lvl w:ilvl="0">
@@ -47410,7 +47362,7 @@
     </w:lvl>
   </w:abstractNum>
   <w:abstractNum w:abstractNumId="39" w15:restartNumberingAfterBreak="0">
-    <w:nsid w:val="5A217120"/>
+    <w:nsid w:val="6DB61F30"/>
     <w:multiLevelType w:val="singleLevel"/>
     <w:tmpl w:val="04090001"/>
     <w:lvl w:ilvl="0">
@@ -47427,7 +47379,7 @@
     </w:lvl>
   </w:abstractNum>
   <w:abstractNum w:abstractNumId="40" w15:restartNumberingAfterBreak="0">
-    <w:nsid w:val="66731D1F"/>
+    <w:nsid w:val="7040223B"/>
     <w:multiLevelType w:val="singleLevel"/>
     <w:tmpl w:val="04090001"/>
     <w:lvl w:ilvl="0">
@@ -47444,7 +47396,7 @@
     </w:lvl>
   </w:abstractNum>
   <w:abstractNum w:abstractNumId="41" w15:restartNumberingAfterBreak="0">
-    <w:nsid w:val="6CA37F85"/>
+    <w:nsid w:val="72027AE6"/>
     <w:multiLevelType w:val="singleLevel"/>
     <w:tmpl w:val="04090001"/>
     <w:lvl w:ilvl="0">
@@ -47461,7 +47413,7 @@
     </w:lvl>
   </w:abstractNum>
   <w:abstractNum w:abstractNumId="42" w15:restartNumberingAfterBreak="0">
-    <w:nsid w:val="6D400E5E"/>
+    <w:nsid w:val="781C2A86"/>
     <w:multiLevelType w:val="singleLevel"/>
     <w:tmpl w:val="04090001"/>
     <w:lvl w:ilvl="0">
@@ -47478,7 +47430,7 @@
     </w:lvl>
   </w:abstractNum>
   <w:abstractNum w:abstractNumId="43" w15:restartNumberingAfterBreak="0">
-    <w:nsid w:val="6EDA72FE"/>
+    <w:nsid w:val="78257939"/>
     <w:multiLevelType w:val="singleLevel"/>
     <w:tmpl w:val="04090001"/>
     <w:lvl w:ilvl="0">
@@ -47495,7 +47447,7 @@
     </w:lvl>
   </w:abstractNum>
   <w:abstractNum w:abstractNumId="44" w15:restartNumberingAfterBreak="0">
-    <w:nsid w:val="761D195B"/>
+    <w:nsid w:val="791608FA"/>
     <w:multiLevelType w:val="singleLevel"/>
     <w:tmpl w:val="04090001"/>
     <w:lvl w:ilvl="0">
@@ -47512,7 +47464,7 @@
     </w:lvl>
   </w:abstractNum>
   <w:abstractNum w:abstractNumId="45" w15:restartNumberingAfterBreak="0">
-    <w:nsid w:val="79FE563C"/>
+    <w:nsid w:val="7B6C212B"/>
     <w:multiLevelType w:val="singleLevel"/>
     <w:tmpl w:val="04090001"/>
     <w:lvl w:ilvl="0">
@@ -47529,7 +47481,7 @@
     </w:lvl>
   </w:abstractNum>
   <w:abstractNum w:abstractNumId="46" w15:restartNumberingAfterBreak="0">
-    <w:nsid w:val="7D3D5BD9"/>
+    <w:nsid w:val="7DEE54BD"/>
     <w:multiLevelType w:val="singleLevel"/>
     <w:tmpl w:val="04090001"/>
     <w:lvl w:ilvl="0">
@@ -47546,7 +47498,7 @@
     </w:lvl>
   </w:abstractNum>
   <w:abstractNum w:abstractNumId="47" w15:restartNumberingAfterBreak="0">
-    <w:nsid w:val="7E3F7D10"/>
+    <w:nsid w:val="7F577386"/>
     <w:multiLevelType w:val="singleLevel"/>
     <w:tmpl w:val="04090001"/>
     <w:lvl w:ilvl="0">
@@ -47562,149 +47514,149 @@
       </w:rPr>
     </w:lvl>
   </w:abstractNum>
-  <w:num w:numId="1" w16cid:durableId="469787789">
+  <w:num w:numId="1" w16cid:durableId="102577439">
+    <w:abstractNumId w:val="15"/>
+  </w:num>
+  <w:num w:numId="2" w16cid:durableId="1315721047">
+    <w:abstractNumId w:val="40"/>
+  </w:num>
+  <w:num w:numId="3" w16cid:durableId="157891883">
+    <w:abstractNumId w:val="39"/>
+  </w:num>
+  <w:num w:numId="4" w16cid:durableId="1552419502">
     <w:abstractNumId w:val="36"/>
   </w:num>
-  <w:num w:numId="2" w16cid:durableId="1215657360">
+  <w:num w:numId="5" w16cid:durableId="1612661119">
+    <w:abstractNumId w:val="32"/>
+  </w:num>
+  <w:num w:numId="6" w16cid:durableId="1229802076">
     <w:abstractNumId w:val="44"/>
   </w:num>
-  <w:num w:numId="3" w16cid:durableId="238446275">
+  <w:num w:numId="7" w16cid:durableId="840194413">
+    <w:abstractNumId w:val="45"/>
+  </w:num>
+  <w:num w:numId="8" w16cid:durableId="1865633668">
+    <w:abstractNumId w:val="17"/>
+  </w:num>
+  <w:num w:numId="9" w16cid:durableId="1801728522">
+    <w:abstractNumId w:val="38"/>
+  </w:num>
+  <w:num w:numId="10" w16cid:durableId="200869877">
+    <w:abstractNumId w:val="35"/>
+  </w:num>
+  <w:num w:numId="11" w16cid:durableId="2022849801">
+    <w:abstractNumId w:val="22"/>
+  </w:num>
+  <w:num w:numId="12" w16cid:durableId="594676191">
+    <w:abstractNumId w:val="28"/>
+  </w:num>
+  <w:num w:numId="13" w16cid:durableId="876160924">
+    <w:abstractNumId w:val="16"/>
+  </w:num>
+  <w:num w:numId="14" w16cid:durableId="348215194">
+    <w:abstractNumId w:val="47"/>
+  </w:num>
+  <w:num w:numId="15" w16cid:durableId="659698512">
+    <w:abstractNumId w:val="19"/>
+  </w:num>
+  <w:num w:numId="16" w16cid:durableId="433482787">
+    <w:abstractNumId w:val="18"/>
+  </w:num>
+  <w:num w:numId="17" w16cid:durableId="499975707">
+    <w:abstractNumId w:val="42"/>
+  </w:num>
+  <w:num w:numId="18" w16cid:durableId="1299996468">
     <w:abstractNumId w:val="7"/>
   </w:num>
-  <w:num w:numId="4" w16cid:durableId="1615290700">
+  <w:num w:numId="19" w16cid:durableId="265384978">
+    <w:abstractNumId w:val="10"/>
+  </w:num>
+  <w:num w:numId="20" w16cid:durableId="242421966">
+    <w:abstractNumId w:val="25"/>
+  </w:num>
+  <w:num w:numId="21" w16cid:durableId="165675898">
+    <w:abstractNumId w:val="1"/>
+  </w:num>
+  <w:num w:numId="22" w16cid:durableId="1894348344">
+    <w:abstractNumId w:val="3"/>
+  </w:num>
+  <w:num w:numId="23" w16cid:durableId="63841062">
+    <w:abstractNumId w:val="6"/>
+  </w:num>
+  <w:num w:numId="24" w16cid:durableId="404960134">
+    <w:abstractNumId w:val="27"/>
+  </w:num>
+  <w:num w:numId="25" w16cid:durableId="1783303015">
+    <w:abstractNumId w:val="4"/>
+  </w:num>
+  <w:num w:numId="26" w16cid:durableId="134762847">
+    <w:abstractNumId w:val="46"/>
+  </w:num>
+  <w:num w:numId="27" w16cid:durableId="957685373">
+    <w:abstractNumId w:val="30"/>
+  </w:num>
+  <w:num w:numId="28" w16cid:durableId="1208300142">
+    <w:abstractNumId w:val="37"/>
+  </w:num>
+  <w:num w:numId="29" w16cid:durableId="968558944">
+    <w:abstractNumId w:val="23"/>
+  </w:num>
+  <w:num w:numId="30" w16cid:durableId="1746999275">
+    <w:abstractNumId w:val="29"/>
+  </w:num>
+  <w:num w:numId="31" w16cid:durableId="892693099">
+    <w:abstractNumId w:val="33"/>
+  </w:num>
+  <w:num w:numId="32" w16cid:durableId="592280341">
+    <w:abstractNumId w:val="12"/>
+  </w:num>
+  <w:num w:numId="33" w16cid:durableId="1216889883">
     <w:abstractNumId w:val="43"/>
   </w:num>
-  <w:num w:numId="5" w16cid:durableId="1068966566">
-    <w:abstractNumId w:val="47"/>
+  <w:num w:numId="34" w16cid:durableId="804929310">
+    <w:abstractNumId w:val="14"/>
   </w:num>
-  <w:num w:numId="6" w16cid:durableId="108746353">
+  <w:num w:numId="35" w16cid:durableId="1460420367">
     <w:abstractNumId w:val="41"/>
   </w:num>
-  <w:num w:numId="7" w16cid:durableId="252865322">
+  <w:num w:numId="36" w16cid:durableId="1969118859">
+    <w:abstractNumId w:val="20"/>
+  </w:num>
+  <w:num w:numId="37" w16cid:durableId="181289938">
+    <w:abstractNumId w:val="0"/>
+  </w:num>
+  <w:num w:numId="38" w16cid:durableId="784664433">
+    <w:abstractNumId w:val="8"/>
+  </w:num>
+  <w:num w:numId="39" w16cid:durableId="361590596">
+    <w:abstractNumId w:val="24"/>
+  </w:num>
+  <w:num w:numId="40" w16cid:durableId="1353145000">
+    <w:abstractNumId w:val="9"/>
+  </w:num>
+  <w:num w:numId="41" w16cid:durableId="2064208208">
+    <w:abstractNumId w:val="13"/>
+  </w:num>
+  <w:num w:numId="42" w16cid:durableId="1844276722">
+    <w:abstractNumId w:val="5"/>
+  </w:num>
+  <w:num w:numId="43" w16cid:durableId="32388051">
+    <w:abstractNumId w:val="34"/>
+  </w:num>
+  <w:num w:numId="44" w16cid:durableId="256594279">
     <w:abstractNumId w:val="2"/>
   </w:num>
-  <w:num w:numId="8" w16cid:durableId="1514688982">
-    <w:abstractNumId w:val="25"/>
+  <w:num w:numId="45" w16cid:durableId="259021944">
+    <w:abstractNumId w:val="11"/>
   </w:num>
-  <w:num w:numId="9" w16cid:durableId="1385524501">
-    <w:abstractNumId w:val="1"/>
+  <w:num w:numId="46" w16cid:durableId="1750540585">
+    <w:abstractNumId w:val="26"/>
   </w:num>
-  <w:num w:numId="10" w16cid:durableId="1338192265">
-    <w:abstractNumId w:val="9"/>
-  </w:num>
-  <w:num w:numId="11" w16cid:durableId="1345938765">
-    <w:abstractNumId w:val="45"/>
-  </w:num>
-  <w:num w:numId="12" w16cid:durableId="2090811129">
-    <w:abstractNumId w:val="3"/>
-  </w:num>
-  <w:num w:numId="13" w16cid:durableId="1685397028">
-    <w:abstractNumId w:val="4"/>
-  </w:num>
-  <w:num w:numId="14" w16cid:durableId="131097972">
-    <w:abstractNumId w:val="39"/>
-  </w:num>
-  <w:num w:numId="15" w16cid:durableId="1274240193">
-    <w:abstractNumId w:val="16"/>
-  </w:num>
-  <w:num w:numId="16" w16cid:durableId="73092204">
-    <w:abstractNumId w:val="6"/>
-  </w:num>
-  <w:num w:numId="17" w16cid:durableId="412630545">
-    <w:abstractNumId w:val="32"/>
-  </w:num>
-  <w:num w:numId="18" w16cid:durableId="486287706">
-    <w:abstractNumId w:val="13"/>
-  </w:num>
-  <w:num w:numId="19" w16cid:durableId="161774248">
-    <w:abstractNumId w:val="38"/>
-  </w:num>
-  <w:num w:numId="20" w16cid:durableId="1643148159">
-    <w:abstractNumId w:val="10"/>
-  </w:num>
-  <w:num w:numId="21" w16cid:durableId="680206971">
-    <w:abstractNumId w:val="5"/>
-  </w:num>
-  <w:num w:numId="22" w16cid:durableId="1481338231">
-    <w:abstractNumId w:val="20"/>
-  </w:num>
-  <w:num w:numId="23" w16cid:durableId="620570050">
-    <w:abstractNumId w:val="33"/>
-  </w:num>
-  <w:num w:numId="24" w16cid:durableId="1098133685">
-    <w:abstractNumId w:val="30"/>
-  </w:num>
-  <w:num w:numId="25" w16cid:durableId="862786288">
-    <w:abstractNumId w:val="19"/>
-  </w:num>
-  <w:num w:numId="26" w16cid:durableId="726296145">
-    <w:abstractNumId w:val="0"/>
-  </w:num>
-  <w:num w:numId="27" w16cid:durableId="1437284554">
-    <w:abstractNumId w:val="37"/>
-  </w:num>
-  <w:num w:numId="28" w16cid:durableId="2120560423">
+  <w:num w:numId="47" w16cid:durableId="1076363335">
     <w:abstractNumId w:val="21"/>
   </w:num>
-  <w:num w:numId="29" w16cid:durableId="1576667601">
-    <w:abstractNumId w:val="24"/>
-  </w:num>
-  <w:num w:numId="30" w16cid:durableId="1727099649">
-    <w:abstractNumId w:val="22"/>
-  </w:num>
-  <w:num w:numId="31" w16cid:durableId="1994868063">
-    <w:abstractNumId w:val="12"/>
-  </w:num>
-  <w:num w:numId="32" w16cid:durableId="1236866463">
-    <w:abstractNumId w:val="15"/>
-  </w:num>
-  <w:num w:numId="33" w16cid:durableId="2127264372">
-    <w:abstractNumId w:val="8"/>
-  </w:num>
-  <w:num w:numId="34" w16cid:durableId="951546849">
+  <w:num w:numId="48" w16cid:durableId="591934352">
     <w:abstractNumId w:val="31"/>
-  </w:num>
-  <w:num w:numId="35" w16cid:durableId="779252961">
-    <w:abstractNumId w:val="17"/>
-  </w:num>
-  <w:num w:numId="36" w16cid:durableId="88233884">
-    <w:abstractNumId w:val="26"/>
-  </w:num>
-  <w:num w:numId="37" w16cid:durableId="1179656710">
-    <w:abstractNumId w:val="46"/>
-  </w:num>
-  <w:num w:numId="38" w16cid:durableId="236748776">
-    <w:abstractNumId w:val="29"/>
-  </w:num>
-  <w:num w:numId="39" w16cid:durableId="1232038799">
-    <w:abstractNumId w:val="11"/>
-  </w:num>
-  <w:num w:numId="40" w16cid:durableId="819928928">
-    <w:abstractNumId w:val="35"/>
-  </w:num>
-  <w:num w:numId="41" w16cid:durableId="96676240">
-    <w:abstractNumId w:val="23"/>
-  </w:num>
-  <w:num w:numId="42" w16cid:durableId="1485274332">
-    <w:abstractNumId w:val="34"/>
-  </w:num>
-  <w:num w:numId="43" w16cid:durableId="1963072080">
-    <w:abstractNumId w:val="14"/>
-  </w:num>
-  <w:num w:numId="44" w16cid:durableId="834105864">
-    <w:abstractNumId w:val="42"/>
-  </w:num>
-  <w:num w:numId="45" w16cid:durableId="2082437503">
-    <w:abstractNumId w:val="27"/>
-  </w:num>
-  <w:num w:numId="46" w16cid:durableId="1303923627">
-    <w:abstractNumId w:val="18"/>
-  </w:num>
-  <w:num w:numId="47" w16cid:durableId="583224773">
-    <w:abstractNumId w:val="28"/>
-  </w:num>
-  <w:num w:numId="48" w16cid:durableId="1460100751">
-    <w:abstractNumId w:val="40"/>
   </w:num>
   <w:numIdMacAtCleanup w:val="48"/>
 </w:numbering>
@@ -48163,7 +48115,7 @@
     <w:uiPriority w:val="9"/>
     <w:unhideWhenUsed/>
     <w:qFormat/>
-    <w:rsid w:val="00172E00"/>
+    <w:rsid w:val="009027FA"/>
     <w:pPr>
       <w:keepNext/>
       <w:keepLines/>
@@ -48426,7 +48378,7 @@
     <w:basedOn w:val="Fuentedeprrafopredeter"/>
     <w:link w:val="Ttulo3"/>
     <w:uiPriority w:val="9"/>
-    <w:rsid w:val="00172E00"/>
+    <w:rsid w:val="009027FA"/>
     <w:rPr>
       <w:rFonts w:ascii="Arial" w:eastAsiaTheme="majorEastAsia" w:hAnsi="Arial" w:cs="Arial"/>
       <w:b/>
@@ -48441,7 +48393,7 @@
     <w:autoRedefine/>
     <w:uiPriority w:val="39"/>
     <w:unhideWhenUsed/>
-    <w:rsid w:val="00172E00"/>
+    <w:rsid w:val="009027FA"/>
     <w:pPr>
       <w:spacing w:after="100"/>
       <w:ind w:left="440"/>

</xml_diff>